<commit_message>
Final_Update: align with complete FIG. 1-55 drawing set
Brief Description now covers FIG. 1-55: existing FIG. 1-18 lines
renumbered to FIG. 9-26 (number only, highlighted, as approved);
descriptions added for FIG. 1-8 and 27-49; new-feature figures
renumbered FIG. 50-55 in the added text. All other original
paragraphs verified byte-identical and in original order.

Co-Authored-By: Claude Opus 5.5 <noreply@anthropic.com>
Claude-Session: https://claude.ai/code/session_01GUsCZvcCggQTPFctneB6J4
</commit_message>
<xml_diff>
--- a/querybook/patent/final_update/Final_Update_AMENDED_clean.docx
+++ b/querybook/patent/final_update/Final_Update_AMENDED_clean.docx
@@ -6515,87 +6515,87 @@
         <w:rPr>
           <w:rFonts w:ascii="Times New Roman" w:hAnsi="Times New Roman"/>
         </w:rPr>
-        <w:t xml:space="preserve">   a. Open Claw ingestion of artifacts of any format — documents, spreadsheets, presentations, page-description files, archives, messages, images, audio, and video — identified by content, divided into located segments, and converted into Fact Units, every artifact being treated as data and never as instruction (FIG. 19).</w:t>
-      </w:r>
-    </w:p>
-    <w:p>
-      <w:pPr>
-        <w:pStyle w:val="Normal"/>
-        <w:bidi w:val="0"/>
-        <w:jc w:val="start"/>
-        <w:rPr>
-          <w:rFonts w:hint="eastAsia"/>
-        </w:rPr>
-      </w:pPr>
-      <w:r>
-        <w:rPr>
-          <w:rFonts w:ascii="Times New Roman" w:hAnsi="Times New Roman"/>
-        </w:rPr>
-        <w:t xml:space="preserve">   b. On-chain certification, in which a sealed Fact Unit, book, or response may optionally be certified as a non-fungible token on a public blockchain carrying its content hash, lineage, and revocation state, verifiable by any party without access to QueryBook (FIG. 20).</w:t>
-      </w:r>
-    </w:p>
-    <w:p>
-      <w:pPr>
-        <w:pStyle w:val="Normal"/>
-        <w:bidi w:val="0"/>
-        <w:jc w:val="start"/>
-        <w:rPr>
-          <w:rFonts w:hint="eastAsia"/>
-        </w:rPr>
-      </w:pPr>
-      <w:r>
-        <w:rPr>
-          <w:rFonts w:ascii="Times New Roman" w:hAnsi="Times New Roman"/>
-        </w:rPr>
-        <w:t xml:space="preserve">   c. An agent protection and deception layer in which every agent call passes an Agent Gateway and is screened by honeycode, honeytokens, tripwires, honeypot agents, an AI-aware firewall, and anomaly detection, a hostile caller being isolated into a synthetic decoy environment with no path to production data (FIG. 21).</w:t>
-      </w:r>
-    </w:p>
-    <w:p>
-      <w:pPr>
-        <w:pStyle w:val="Normal"/>
-        <w:bidi w:val="0"/>
-        <w:jc w:val="start"/>
-        <w:rPr>
-          <w:rFonts w:hint="eastAsia"/>
-        </w:rPr>
-      </w:pPr>
-      <w:r>
-        <w:rPr>
-          <w:rFonts w:ascii="Times New Roman" w:hAnsi="Times New Roman"/>
-        </w:rPr>
-        <w:t xml:space="preserve">   d. A tamper-evident security record of hash-chained entries sealed by write-once, signed Merkle checkpoints, mirrored and optionally anchored on a public blockchain, and verified by recomputation from content (FIG. 22).</w:t>
-      </w:r>
-    </w:p>
-    <w:p>
-      <w:pPr>
-        <w:pStyle w:val="Normal"/>
-        <w:bidi w:val="0"/>
-        <w:jc w:val="start"/>
-        <w:rPr>
-          <w:rFonts w:hint="eastAsia"/>
-        </w:rPr>
-      </w:pPr>
-      <w:r>
-        <w:rPr>
-          <w:rFonts w:ascii="Times New Roman" w:hAnsi="Times New Roman"/>
-        </w:rPr>
-        <w:t xml:space="preserve">   e. Agent interoperability through a Model Context Protocol tool server and an OpenClaw skill, every external agent call passing the Agent Gateway under that agent’s allow-list (FIG. 23).</w:t>
-      </w:r>
-    </w:p>
-    <w:p>
-      <w:pPr>
-        <w:pStyle w:val="Normal"/>
-        <w:bidi w:val="0"/>
-        <w:jc w:val="start"/>
-        <w:rPr>
-          <w:rFonts w:hint="eastAsia"/>
-        </w:rPr>
-      </w:pPr>
-      <w:r>
-        <w:rPr>
-          <w:rFonts w:ascii="Times New Roman" w:hAnsi="Times New Roman"/>
-        </w:rPr>
-        <w:t xml:space="preserve">   f. A framed hybrid transport extending the QueryBook-enhanced TCP/IP protocol, carrying Fact Units and media in checksummed, optionally signed frames on separate priority lanes and rebuilding media into standard HLS, MPEG-DASH, or RTMP streams (FIG. 24).</w:t>
+        <w:t xml:space="preserve">   a. Open Claw ingestion of artifacts of any format — documents, spreadsheets, presentations, page-description files, archives, messages, images, audio, and video — identified by content, divided into located segments, and converted into Fact Units, every artifact being treated as data and never as instruction (FIG. 50).</w:t>
+      </w:r>
+    </w:p>
+    <w:p>
+      <w:pPr>
+        <w:pStyle w:val="Normal"/>
+        <w:bidi w:val="0"/>
+        <w:jc w:val="start"/>
+        <w:rPr>
+          <w:rFonts w:hint="eastAsia"/>
+        </w:rPr>
+      </w:pPr>
+      <w:r>
+        <w:rPr>
+          <w:rFonts w:ascii="Times New Roman" w:hAnsi="Times New Roman"/>
+        </w:rPr>
+        <w:t xml:space="preserve">   b. On-chain certification, in which a sealed Fact Unit, book, or response may optionally be certified as a non-fungible token on a public blockchain carrying its content hash, lineage, and revocation state, verifiable by any party without access to QueryBook (FIG. 51).</w:t>
+      </w:r>
+    </w:p>
+    <w:p>
+      <w:pPr>
+        <w:pStyle w:val="Normal"/>
+        <w:bidi w:val="0"/>
+        <w:jc w:val="start"/>
+        <w:rPr>
+          <w:rFonts w:hint="eastAsia"/>
+        </w:rPr>
+      </w:pPr>
+      <w:r>
+        <w:rPr>
+          <w:rFonts w:ascii="Times New Roman" w:hAnsi="Times New Roman"/>
+        </w:rPr>
+        <w:t xml:space="preserve">   c. An agent protection and deception layer in which every agent call passes an Agent Gateway and is screened by honeycode, honeytokens, tripwires, honeypot agents, an AI-aware firewall, and anomaly detection, a hostile caller being isolated into a synthetic decoy environment with no path to production data (FIG. 52).</w:t>
+      </w:r>
+    </w:p>
+    <w:p>
+      <w:pPr>
+        <w:pStyle w:val="Normal"/>
+        <w:bidi w:val="0"/>
+        <w:jc w:val="start"/>
+        <w:rPr>
+          <w:rFonts w:hint="eastAsia"/>
+        </w:rPr>
+      </w:pPr>
+      <w:r>
+        <w:rPr>
+          <w:rFonts w:ascii="Times New Roman" w:hAnsi="Times New Roman"/>
+        </w:rPr>
+        <w:t xml:space="preserve">   d. A tamper-evident security record of hash-chained entries sealed by write-once, signed Merkle checkpoints, mirrored and optionally anchored on a public blockchain, and verified by recomputation from content (FIG. 53).</w:t>
+      </w:r>
+    </w:p>
+    <w:p>
+      <w:pPr>
+        <w:pStyle w:val="Normal"/>
+        <w:bidi w:val="0"/>
+        <w:jc w:val="start"/>
+        <w:rPr>
+          <w:rFonts w:hint="eastAsia"/>
+        </w:rPr>
+      </w:pPr>
+      <w:r>
+        <w:rPr>
+          <w:rFonts w:ascii="Times New Roman" w:hAnsi="Times New Roman"/>
+        </w:rPr>
+        <w:t xml:space="preserve">   e. Agent interoperability through a Model Context Protocol tool server and an OpenClaw skill, every external agent call passing the Agent Gateway under that agent’s allow-list (FIG. 54).</w:t>
+      </w:r>
+    </w:p>
+    <w:p>
+      <w:pPr>
+        <w:pStyle w:val="Normal"/>
+        <w:bidi w:val="0"/>
+        <w:jc w:val="start"/>
+        <w:rPr>
+          <w:rFonts w:hint="eastAsia"/>
+        </w:rPr>
+      </w:pPr>
+      <w:r>
+        <w:rPr>
+          <w:rFonts w:ascii="Times New Roman" w:hAnsi="Times New Roman"/>
+        </w:rPr>
+        <w:t xml:space="preserve">   f. A framed hybrid transport extending the QueryBook-enhanced TCP/IP protocol, carrying Fact Units and media in checksummed, optionally signed frames on separate priority lanes and rebuilding media into standard HLS, MPEG-DASH, or RTMP streams (FIG. 55).</w:t>
       </w:r>
     </w:p>
     <w:p>
@@ -6716,7 +6716,7 @@
           <w:sz w:val="36"/>
           <w:szCs w:val="36"/>
         </w:rPr>
-        <w:t>is a block diagram of the system, showing the ingestion pipeline, the storage engine, the UFCS substrate, the FQL query engine, the verification ledger, and the federation boundary.</w:t>
+        <w:t xml:space="preserve">is a block diagram of the overall QueryBook Language Expression Layer (LEL) system architecture.</w:t>
       </w:r>
     </w:p>
     <w:p>
@@ -6744,7 +6744,7 @@
           <w:sz w:val="36"/>
           <w:szCs w:val="36"/>
         </w:rPr>
-        <w:t>is a diagram of a Fact Atom carried within a Fact Envelope, showing the nucleus, group classification, polarity, and links of the atom, together with the envelope's confidence, provenance, certification, and content-derived identifier.</w:t>
+        <w:t xml:space="preserve">is a block diagram of the Sub-Language Priming Layer (SLPL) and the measurable representation produced by each of its six components.</w:t>
       </w:r>
     </w:p>
     <w:p>
@@ -6772,7 +6772,7 @@
           <w:sz w:val="36"/>
           <w:szCs w:val="36"/>
         </w:rPr>
-        <w:t>is a diagram of a fact-certification authority hierarchy, showing a root trust anchor, domain authorities, and the certified facts and trust scores derived beneath them.</w:t>
+        <w:t xml:space="preserve">is a flow diagram of the developmental learning sequence and the one-way Transition Gate having four readiness thresholds.</w:t>
       </w:r>
     </w:p>
     <w:p>
@@ -6800,7 +6800,7 @@
           <w:sz w:val="36"/>
           <w:szCs w:val="36"/>
         </w:rPr>
-        <w:t>is a diagram of the substrate relationships, showing a pairwise graph, a hyperedge, and a directed hyperchain among Fact Units.</w:t>
+        <w:t xml:space="preserve">is a block diagram of the multilingual Delta Acquisition Model and the acquisition acceleration flywheel.</w:t>
       </w:r>
     </w:p>
     <w:p>
@@ -6828,7 +6828,7 @@
           <w:sz w:val="36"/>
           <w:szCs w:val="36"/>
         </w:rPr>
-        <w:t>is a diagram supporting claim 11, showing tour/exhibition sequencing of immersive scenes into ordered waypoints.</w:t>
+        <w:t xml:space="preserve">is a block diagram of the seven-stage Speech Output Pipeline.</w:t>
       </w:r>
     </w:p>
     <w:p>
@@ -6856,7 +6856,7 @@
           <w:sz w:val="36"/>
           <w:szCs w:val="36"/>
         </w:rPr>
-        <w:t>is a diagram of a query that filters jointly on fact structure and certification trust, and of the trust-native execution by propagation, branch-and-bound pruning, and contradiction exclusion.</w:t>
+        <w:t xml:space="preserve">is a data-flow diagram of the co-grounded integration of the LEL with the Federated Query Language (FQL) and the Universal Federated Connectivity System (UFCS).</w:t>
       </w:r>
     </w:p>
     <w:p>
@@ -6884,7 +6884,7 @@
           <w:sz w:val="36"/>
           <w:szCs w:val="36"/>
         </w:rPr>
-        <w:t>is a flowchart of verifying machine-generated text against certified records, classifying each assertion as verified, contradicted, or unknown.</w:t>
+        <w:t xml:space="preserve">is a block diagram of a reduced-to-practice embodiment (the Language Lab) implementing Phase One, the Transition Gate, and a deterministic Phase Two.</w:t>
       </w:r>
     </w:p>
     <w:p>
@@ -6912,7 +6912,7 @@
           <w:sz w:val="36"/>
           <w:szCs w:val="36"/>
         </w:rPr>
-        <w:t>is a diagram of federation, showing a certified envelope crossing a boundary and being re-validated on the receiving side.</w:t>
+        <w:t xml:space="preserve">is a data-flow diagram of the deterministic Phase-Two semantic grounding of the reduced-to-practice embodiment, in which word meanings are attached only from auditable sources — a bundled public-domain dictionary and self-grounding against verified Fact Units in the store — with any large-language-model meaning source excluded from the grounding path.</w:t>
       </w:r>
     </w:p>
     <w:p>
@@ -6940,7 +6940,7 @@
           <w:sz w:val="36"/>
           <w:szCs w:val="36"/>
         </w:rPr>
-        <w:t>is a diagram of fact-level erasure using an externally held key (cryptographic shredding of a sealed payload).</w:t>
+        <w:t>is a block diagram of the system, showing the ingestion pipeline, the storage engine, the UFCS substrate, the FQL query engine, the verification ledger, and the federation boundary.</w:t>
       </w:r>
     </w:p>
     <w:p>
@@ -6968,7 +6968,7 @@
           <w:sz w:val="36"/>
           <w:szCs w:val="36"/>
         </w:rPr>
-        <w:t>is a diagram of the Universal Security Architecture, showing the twelve defensive layers, the five simultaneous defensive postures, and key mechanisms including the AI Attack Prediction Engine.</w:t>
+        <w:t>is a diagram of a Fact Atom carried within a Fact Envelope, showing the nucleus, group classification, polarity, and links of the atom, together with the envelope's confidence, provenance, certification, and content-derived identifier.</w:t>
       </w:r>
     </w:p>
     <w:p>
@@ -6996,7 +6996,7 @@
           <w:sz w:val="36"/>
           <w:szCs w:val="36"/>
         </w:rPr>
-        <w:t>is a diagram of Universal Honeypot Saturation and the Data Firehose, showing port saturation via the Phantom Port Daemon and application-entry-point saturation via the Shadow-App mechanism.</w:t>
+        <w:t>is a diagram of a fact-certification authority hierarchy, showing a root trust anchor, domain authorities, and the certified facts and trust scores derived beneath them.</w:t>
       </w:r>
     </w:p>
     <w:p>
@@ -7024,7 +7024,7 @@
           <w:sz w:val="36"/>
           <w:szCs w:val="36"/>
         </w:rPr>
-        <w:t>is a diagram of the five deployment topologies — cloud SaaS, local server, hybrid, single-device, and edge — over the invariant common layer of safety, governance, and provenance.</w:t>
+        <w:t>is a diagram of the substrate relationships, showing a pairwise graph, a hyperedge, and a directed hyperchain among Fact Units.</w:t>
       </w:r>
     </w:p>
     <w:p>
@@ -7052,7 +7052,7 @@
           <w:sz w:val="36"/>
           <w:szCs w:val="36"/>
         </w:rPr>
-        <w:t>is a diagram of the Adaptive Response Engine, showing the five-stage pipeline from Result-Set Analysis through Generation-Directive Assembly, with the directive fixed before generation begins.</w:t>
+        <w:t>is a diagram supporting claim 11, showing tour/exhibition sequencing of immersive scenes into ordered waypoints.</w:t>
       </w:r>
     </w:p>
     <w:p>
@@ -7080,7 +7080,7 @@
           <w:sz w:val="36"/>
           <w:szCs w:val="36"/>
         </w:rPr>
-        <w:t>is a diagram of the user-owned agent system, showing Blueprint definition and registration, Agent-Instance creation under commissioner-bounded authority, and the governance evaluation at each action.</w:t>
+        <w:t>is a diagram of a query that filters jointly on fact structure and certification trust, and of the trust-native execution by propagation, branch-and-bound pruning, and contradiction exclusion.</w:t>
       </w:r>
     </w:p>
     <w:p>
@@ -7108,7 +7108,7 @@
           <w:sz w:val="36"/>
           <w:szCs w:val="36"/>
         </w:rPr>
-        <w:t>is a diagram of deterministic multi-language regeneration, showing source ingestion to Fact Units, the language-independent Fact Unit graph as a single knowledge source, and regeneration into any target language.</w:t>
+        <w:t>is a flowchart of verifying machine-generated text against certified records, classifying each assertion as verified, contradicted, or unknown.</w:t>
       </w:r>
     </w:p>
     <w:p>
@@ -7136,7 +7136,7 @@
           <w:sz w:val="36"/>
           <w:szCs w:val="36"/>
         </w:rPr>
-        <w:t>is a diagram of semantic compression, expansion, colorization, and resolution upscaling, showing the meaning-storage compression flow and the on-demand regeneration of a surface representation.</w:t>
+        <w:t>is a diagram of federation, showing a certified envelope crossing a boundary and being re-validated on the receiving side.</w:t>
       </w:r>
     </w:p>
     <w:p>
@@ -7164,7 +7164,7 @@
           <w:sz w:val="36"/>
           <w:szCs w:val="36"/>
         </w:rPr>
-        <w:t>is a diagram of the QueryBook-enhanced TCP/IP hybrid protocol packet, showing the optional semantic-metadata header carrying FUID, ProvenanceRef, and confidence fields alongside the standard headers and payload.</w:t>
+        <w:t>is a diagram of fact-level erasure using an externally held key (cryptographic shredding of a sealed payload).</w:t>
       </w:r>
     </w:p>
     <w:p>
@@ -7192,7 +7192,7 @@
           <w:sz w:val="36"/>
           <w:szCs w:val="36"/>
         </w:rPr>
-        <w:t>is a diagram of the Neuromorphic Cognitive Layer and attractor network, showing the energy function, the capacity ceiling, and convergence to a stable equilibrium.</w:t>
+        <w:t>is a diagram of the Universal Security Architecture, showing the twelve defensive layers, the five simultaneous defensive postures, and key mechanisms including the AI Attack Prediction Engine.</w:t>
       </w:r>
     </w:p>
     <w:p>
@@ -7220,7 +7220,7 @@
           <w:sz w:val="36"/>
           <w:szCs w:val="36"/>
         </w:rPr>
-        <w:t xml:space="preserve">is a block diagram of Open Claw ingestion, showing content-based format detection, archive bounds, the Artifact Segmenter, the instruction-like content screen, the OpenClaw Interpreter, and the admission of artifact-description, structured, passage, and flagged untrusted records to the Fact Unit store under a provenance seal.</w:t>
+        <w:t>is a diagram of Universal Honeypot Saturation and the Data Firehose, showing port saturation via the Phantom Port Daemon and application-entry-point saturation via the Shadow-App mechanism.</w:t>
       </w:r>
     </w:p>
     <w:p>
@@ -7248,7 +7248,7 @@
           <w:sz w:val="36"/>
           <w:szCs w:val="36"/>
         </w:rPr>
-        <w:t xml:space="preserve">is a block diagram of on-chain certification, showing a QueryBook object and its local provenance seal, the content hash and on-chain metadata, the in-system transaction signer and network guard, the certificate contract on a public blockchain, the independent verifier, and the licence check.</w:t>
+        <w:t>is a diagram of the five deployment topologies — cloud SaaS, local server, hybrid, single-device, and edge — over the invariant common layer of safety, governance, and provenance.</w:t>
       </w:r>
     </w:p>
     <w:p>
@@ -7276,7 +7276,7 @@
           <w:sz w:val="36"/>
           <w:szCs w:val="36"/>
         </w:rPr>
-        <w:t xml:space="preserve">is a block diagram of the agent protection and deception layer, showing the HTTP gate, the isolation register, the Agent Gateway, the deception check with honeycode, honeytokens, tripwires, and honeypot agents, the AI-aware firewall and anomaly detector, the security event bus, the decoy environment, the engagement recorder, and operator-only release.</w:t>
+        <w:t>is a diagram of the Adaptive Response Engine, showing the five-stage pipeline from Result-Set Analysis through Generation-Directive Assembly, with the directive fixed before generation begins.</w:t>
       </w:r>
     </w:p>
     <w:p>
@@ -7304,7 +7304,7 @@
           <w:sz w:val="36"/>
           <w:szCs w:val="36"/>
         </w:rPr>
-        <w:t xml:space="preserve">is a block diagram of the tamper-evident security record, showing append-only entries, the hash chain, write-once signed Merkle checkpoints, a mirror on a second device, a blockchain anchor, the recompute-from-content verifier with inclusion proofs, and the assurance report.</w:t>
+        <w:t>is a diagram of the user-owned agent system, showing Blueprint definition and registration, Agent-Instance creation under commissioner-bounded authority, and the governance evaluation at each action.</w:t>
       </w:r>
     </w:p>
     <w:p>
@@ -7332,7 +7332,7 @@
           <w:sz w:val="36"/>
           <w:szCs w:val="36"/>
         </w:rPr>
-        <w:t xml:space="preserve">is a block diagram of agent interoperability, showing an external AI agent and its skill definition, the Model Context Protocol tool server, the tool-to-command mapping, the Agent Gateway with the agent’s allow-list, grounded handlers, and isolation upon a reserved command.</w:t>
+        <w:t>is a diagram of deterministic multi-language regeneration, showing source ingestion to Fact Units, the language-independent Fact Unit graph as a single knowledge source, and regeneration into any target language.</w:t>
       </w:r>
     </w:p>
     <w:p>
@@ -7360,15 +7360,15 @@
           <w:sz w:val="36"/>
           <w:szCs w:val="36"/>
         </w:rPr>
-        <w:t xml:space="preserve">is a block diagram of the framed hybrid transport, extending FIG. 17, showing per-type compression, the frame with its header, metadata, payload, CRC32 checksum, and optional signature, the control, normal, and bulk lanes, the receiver, package rebuild with manifest check, and record verification into the Fact Unit store.</w:t>
-      </w:r>
-    </w:p>
-    <w:p>
-      <w:pPr>
-        <w:pStyle w:val="Normal"/>
-        <w:bidi w:val="0"/>
-        <w:spacing w:before="200" w:after="160"/>
-        <w:jc w:val="start"/>
+        <w:t>is a diagram of semantic compression, expansion, colorization, and resolution upscaling, showing the meaning-storage compression flow and the on-demand regeneration of a surface representation.</w:t>
+      </w:r>
+    </w:p>
+    <w:p>
+      <w:pPr>
+        <w:pStyle w:val="Normal"/>
+        <w:bidi w:val="0"/>
+        <w:ind w:firstLine="432"/>
+        <w:jc w:val="both"/>
         <w:rPr>
           <w:rFonts w:hint="eastAsia"/>
           <w:sz w:val="36"/>
@@ -7377,27 +7377,892 @@
       </w:pPr>
       <w:r>
         <w:rPr>
+          <w:b/>
+          <w:sz w:val="36"/>
+          <w:szCs w:val="36"/>
+        </w:rPr>
+        <w:t xml:space="preserve">FIG. 25 </w:t>
+      </w:r>
+      <w:r>
+        <w:rPr>
+          <w:sz w:val="36"/>
+          <w:szCs w:val="36"/>
+        </w:rPr>
+        <w:t>is a diagram of the QueryBook-enhanced TCP/IP hybrid protocol packet, showing the optional semantic-metadata header carrying FUID, ProvenanceRef, and confidence fields alongside the standard headers and payload.</w:t>
+      </w:r>
+    </w:p>
+    <w:p>
+      <w:pPr>
+        <w:pStyle w:val="Normal"/>
+        <w:bidi w:val="0"/>
+        <w:ind w:firstLine="432"/>
+        <w:jc w:val="both"/>
+        <w:rPr>
+          <w:rFonts w:hint="eastAsia"/>
+          <w:sz w:val="36"/>
+          <w:szCs w:val="36"/>
+        </w:rPr>
+      </w:pPr>
+      <w:r>
+        <w:rPr>
+          <w:b/>
+          <w:sz w:val="36"/>
+          <w:szCs w:val="36"/>
+        </w:rPr>
+        <w:t xml:space="preserve">FIG. 26 </w:t>
+      </w:r>
+      <w:r>
+        <w:rPr>
+          <w:sz w:val="36"/>
+          <w:szCs w:val="36"/>
+        </w:rPr>
+        <w:t>is a diagram of the Neuromorphic Cognitive Layer and attractor network, showing the energy function, the capacity ceiling, and convergence to a stable equilibrium.</w:t>
+      </w:r>
+    </w:p>
+    <w:p>
+      <w:pPr>
+        <w:pStyle w:val="Normal"/>
+        <w:bidi w:val="0"/>
+        <w:ind w:firstLine="432"/>
+        <w:jc w:val="both"/>
+        <w:rPr>
+          <w:rFonts w:hint="eastAsia"/>
+          <w:sz w:val="36"/>
+          <w:szCs w:val="36"/>
+        </w:rPr>
+      </w:pPr>
+      <w:r>
+        <w:rPr>
+          <w:b/>
+          <w:sz w:val="36"/>
+          <w:szCs w:val="36"/>
+        </w:rPr>
+        <w:t xml:space="preserve">FIG. 27 </w:t>
+      </w:r>
+      <w:r>
+        <w:rPr>
+          <w:sz w:val="36"/>
+          <w:szCs w:val="36"/>
+        </w:rPr>
+        <w:t xml:space="preserve">is a diagram of the Fact Unit confidence and evidence model, comprising an evidence pair, a Beta posterior, a score, a credible interval, source diversity, temporal decay, and a confidence trend.</w:t>
+      </w:r>
+    </w:p>
+    <w:p>
+      <w:pPr>
+        <w:pStyle w:val="Normal"/>
+        <w:bidi w:val="0"/>
+        <w:ind w:firstLine="432"/>
+        <w:jc w:val="both"/>
+        <w:rPr>
+          <w:rFonts w:hint="eastAsia"/>
+          <w:sz w:val="36"/>
+          <w:szCs w:val="36"/>
+        </w:rPr>
+      </w:pPr>
+      <w:r>
+        <w:rPr>
+          <w:b/>
+          <w:sz w:val="36"/>
+          <w:szCs w:val="36"/>
+        </w:rPr>
+        <w:t xml:space="preserve">FIG. 28 </w:t>
+      </w:r>
+      <w:r>
+        <w:rPr>
+          <w:sz w:val="36"/>
+          <w:szCs w:val="36"/>
+        </w:rPr>
+        <w:t xml:space="preserve">is a diagram of the UFCS packet structure, showing the fields of a serialized Fact Unit record and an exemplar packet.</w:t>
+      </w:r>
+    </w:p>
+    <w:p>
+      <w:pPr>
+        <w:pStyle w:val="Normal"/>
+        <w:bidi w:val="0"/>
+        <w:ind w:firstLine="432"/>
+        <w:jc w:val="both"/>
+        <w:rPr>
+          <w:rFonts w:hint="eastAsia"/>
+          <w:sz w:val="36"/>
+          <w:szCs w:val="36"/>
+        </w:rPr>
+      </w:pPr>
+      <w:r>
+        <w:rPr>
+          <w:b/>
+          <w:sz w:val="36"/>
+          <w:szCs w:val="36"/>
+        </w:rPr>
+        <w:t xml:space="preserve">FIG. 29 </w:t>
+      </w:r>
+      <w:r>
+        <w:rPr>
+          <w:sz w:val="36"/>
+          <w:szCs w:val="36"/>
+        </w:rPr>
+        <w:t xml:space="preserve">is a diagram of UFCS packet framing, in which immutable packets are de-duplicated by fingerprint and appended to content-addressed blocks under a fingerprint index.</w:t>
+      </w:r>
+    </w:p>
+    <w:p>
+      <w:pPr>
+        <w:pStyle w:val="Normal"/>
+        <w:bidi w:val="0"/>
+        <w:ind w:firstLine="432"/>
+        <w:jc w:val="both"/>
+        <w:rPr>
+          <w:rFonts w:hint="eastAsia"/>
+          <w:sz w:val="36"/>
+          <w:szCs w:val="36"/>
+        </w:rPr>
+      </w:pPr>
+      <w:r>
+        <w:rPr>
+          <w:b/>
+          <w:sz w:val="36"/>
+          <w:szCs w:val="36"/>
+        </w:rPr>
+        <w:t xml:space="preserve">FIG. 30 </w:t>
+      </w:r>
+      <w:r>
+        <w:rPr>
+          <w:sz w:val="36"/>
+          <w:szCs w:val="36"/>
+        </w:rPr>
+        <w:t xml:space="preserve">is a diagram of FQL query anatomy with a worked example, in which match, where, exclude, rank, and return clauses produce a highest-trust answer bound to its evidence by a provenance hash.</w:t>
+      </w:r>
+    </w:p>
+    <w:p>
+      <w:pPr>
+        <w:pStyle w:val="Normal"/>
+        <w:bidi w:val="0"/>
+        <w:ind w:firstLine="432"/>
+        <w:jc w:val="both"/>
+        <w:rPr>
+          <w:rFonts w:hint="eastAsia"/>
+          <w:sz w:val="36"/>
+          <w:szCs w:val="36"/>
+        </w:rPr>
+      </w:pPr>
+      <w:r>
+        <w:rPr>
+          <w:b/>
+          <w:sz w:val="36"/>
+          <w:szCs w:val="36"/>
+        </w:rPr>
+        <w:t xml:space="preserve">FIG. 31 </w:t>
+      </w:r>
+      <w:r>
+        <w:rPr>
+          <w:sz w:val="36"/>
+          <w:szCs w:val="36"/>
+        </w:rPr>
+        <w:t xml:space="preserve">is a block diagram of the advanced multilingual pronunciation subsystem and self-contained speech output of the reduced-to-practice embodiment, showing the pronunciation preference ladder (bundled open-source phonemizer, then per-language rule-seeded grapheme-to-phoneme tables, then an explicit non-fabricated null), the single-call phrase transcription that keeps the displayed transcription consistent with the synthesized audio, and the self-contained bundle and engine-selection ladder that produce offline audio or an honest refusal without fabricating audio.</w:t>
+      </w:r>
+    </w:p>
+    <w:p>
+      <w:pPr>
+        <w:pStyle w:val="Normal"/>
+        <w:bidi w:val="0"/>
+        <w:ind w:firstLine="432"/>
+        <w:jc w:val="both"/>
+        <w:rPr>
+          <w:rFonts w:hint="eastAsia"/>
+          <w:sz w:val="36"/>
+          <w:szCs w:val="36"/>
+        </w:rPr>
+      </w:pPr>
+      <w:r>
+        <w:rPr>
+          <w:b/>
+          <w:sz w:val="36"/>
+          <w:szCs w:val="36"/>
+        </w:rPr>
+        <w:t xml:space="preserve">FIG. 32 </w:t>
+      </w:r>
+      <w:r>
+        <w:rPr>
+          <w:sz w:val="36"/>
+          <w:szCs w:val="36"/>
+        </w:rPr>
+        <w:t xml:space="preserve">is a flow diagram of the permanent, deterministic pronunciation-and-speech quality-control battery of the reduced-to-practice embodiment, which, for each supported language and without a large language model, verifies that a phonemic transcription is produced, that the syllable count is within tolerance, and that a short phrase synthesizes to a valid audio waveform, returning a per-language report and an overall pass score.</w:t>
+      </w:r>
+    </w:p>
+    <w:p>
+      <w:pPr>
+        <w:pStyle w:val="Normal"/>
+        <w:bidi w:val="0"/>
+        <w:ind w:firstLine="432"/>
+        <w:jc w:val="both"/>
+        <w:rPr>
+          <w:rFonts w:hint="eastAsia"/>
+          <w:sz w:val="36"/>
+          <w:szCs w:val="36"/>
+        </w:rPr>
+      </w:pPr>
+      <w:r>
+        <w:rPr>
+          <w:b/>
+          <w:sz w:val="36"/>
+          <w:szCs w:val="36"/>
+        </w:rPr>
+        <w:t xml:space="preserve">FIG. 33 </w:t>
+      </w:r>
+      <w:r>
+        <w:rPr>
+          <w:sz w:val="36"/>
+          <w:szCs w:val="36"/>
+        </w:rPr>
+        <w:t xml:space="preserve">is a data-flow diagram of the Language &amp; Identity Linking (LIL) voiceprint enrollment and matching subsystem, in which a consent-gated capture produces an acoustic speaker embedding (voiceprint), a match against stored voiceprints is passed through a QueryBook trust gate returning VERIFIED, CONTRADICTED, or UNKNOWN, and verified identity links are written as provenance-tracked, trust-scored Fact Units in the identity graph, with cross-script name and entity resolution performed by the language subsystem.</w:t>
+      </w:r>
+    </w:p>
+    <w:p>
+      <w:pPr>
+        <w:pStyle w:val="Normal"/>
+        <w:bidi w:val="0"/>
+        <w:ind w:firstLine="432"/>
+        <w:jc w:val="both"/>
+        <w:rPr>
+          <w:rFonts w:hint="eastAsia"/>
+          <w:sz w:val="36"/>
+          <w:szCs w:val="36"/>
+        </w:rPr>
+      </w:pPr>
+      <w:r>
+        <w:rPr>
+          <w:b/>
+          <w:sz w:val="36"/>
+          <w:szCs w:val="36"/>
+        </w:rPr>
+        <w:t xml:space="preserve">FIG. 34 </w:t>
+      </w:r>
+      <w:r>
+        <w:rPr>
+          <w:sz w:val="36"/>
+          <w:szCs w:val="36"/>
+        </w:rPr>
+        <w:t xml:space="preserve">is a flow diagram of the LIL trust-gated voice authentication process, in which a claimed-identity verification produces a match score and anti-spoofing signals that feed a deterministic risk-scoring policy and a decision gate returning accept, challenge (second factor), or reject, each decision recorded as a provenance-tracked auth-event Fact Unit.</w:t>
+      </w:r>
+    </w:p>
+    <w:p>
+      <w:pPr>
+        <w:pStyle w:val="Normal"/>
+        <w:bidi w:val="0"/>
+        <w:ind w:firstLine="432"/>
+        <w:jc w:val="both"/>
+        <w:rPr>
+          <w:rFonts w:hint="eastAsia"/>
+          <w:sz w:val="36"/>
+          <w:szCs w:val="36"/>
+        </w:rPr>
+      </w:pPr>
+      <w:r>
+        <w:rPr>
+          <w:b/>
+          <w:sz w:val="36"/>
+          <w:szCs w:val="36"/>
+        </w:rPr>
+        <w:t xml:space="preserve">FIG. 35 </w:t>
+      </w:r>
+      <w:r>
+        <w:rPr>
+          <w:sz w:val="36"/>
+          <w:szCs w:val="36"/>
+        </w:rPr>
+        <w:t xml:space="preserve">is a block diagram of the Universal Integrity Audit Service (UIAS), in which connector and ingestion agents observe an unmodified monitored system at multiple workflow positions and seal each observable event as a content-addressed Fact Unit carrying a content hash, a one-way submitter-identity hash, an independent nanosecond timestamp, a source fingerprint, and the sealing agent’s identity; a similarity-detection agent sets a contemporaneous cross-party anomaly flag over content signatures without storing content; and a verification agent continuously re-verifies the append-only Fact-Unit ledger.</w:t>
+      </w:r>
+    </w:p>
+    <w:p>
+      <w:pPr>
+        <w:pStyle w:val="Normal"/>
+        <w:bidi w:val="0"/>
+        <w:ind w:firstLine="432"/>
+        <w:jc w:val="both"/>
+        <w:rPr>
+          <w:rFonts w:hint="eastAsia"/>
+          <w:sz w:val="36"/>
+          <w:szCs w:val="36"/>
+        </w:rPr>
+      </w:pPr>
+      <w:r>
+        <w:rPr>
+          <w:b/>
+          <w:sz w:val="36"/>
+          <w:szCs w:val="36"/>
+        </w:rPr>
+        <w:t xml:space="preserve">FIG. 36 </w:t>
+      </w:r>
+      <w:r>
+        <w:rPr>
+          <w:sz w:val="36"/>
+          <w:szCs w:val="36"/>
+        </w:rPr>
+        <w:t xml:space="preserve">is a flow diagram of the UIAS signed Proof Package generation, in which, on an accusation or inquiry, a proof-package agent assembles verified sealed Fact Units, the similarity-log entry, a chronological ledger extract bound by the response-provenance hash, and a factual determination from the arbitration agent under the Prime-Directive gate, and signs the package under the UIAS independent identity to produce independent, pre-dispute, tamper-proof, complete, and admissible evidence.</w:t>
+      </w:r>
+    </w:p>
+    <w:p>
+      <w:pPr>
+        <w:pStyle w:val="Normal"/>
+        <w:bidi w:val="0"/>
+        <w:ind w:firstLine="432"/>
+        <w:jc w:val="both"/>
+        <w:rPr>
+          <w:rFonts w:hint="eastAsia"/>
+          <w:sz w:val="36"/>
+          <w:szCs w:val="36"/>
+        </w:rPr>
+      </w:pPr>
+      <w:r>
+        <w:rPr>
+          <w:b/>
+          <w:sz w:val="36"/>
+          <w:szCs w:val="36"/>
+        </w:rPr>
+        <w:t xml:space="preserve">FIG. 37 </w:t>
+      </w:r>
+      <w:r>
+        <w:rPr>
+          <w:sz w:val="36"/>
+          <w:szCs w:val="36"/>
+        </w:rPr>
+        <w:t xml:space="preserve">is a data-flow diagram of the Paralinguistic &amp; Pragmatic Interpretation Layer (PIL) applied to an ingested voice, in which a paralinguistic analyzer produces measured acoustic readings and a labeled arousal estimate while a pragmatic framer applies sourced context, perspective, ergonomics, culture, and social-mores frames, the two combining into an Interpretation Frame written as provenance-tracked Fact Units, with estimates labeled and never asserted as true feelings.</w:t>
+      </w:r>
+    </w:p>
+    <w:p>
+      <w:pPr>
+        <w:pStyle w:val="Normal"/>
+        <w:bidi w:val="0"/>
+        <w:ind w:firstLine="432"/>
+        <w:jc w:val="both"/>
+        <w:rPr>
+          <w:rFonts w:hint="eastAsia"/>
+          <w:sz w:val="36"/>
+          <w:szCs w:val="36"/>
+        </w:rPr>
+      </w:pPr>
+      <w:r>
+        <w:rPr>
+          <w:b/>
+          <w:sz w:val="36"/>
+          <w:szCs w:val="36"/>
+        </w:rPr>
+        <w:t xml:space="preserve">FIG. 38 </w:t>
+      </w:r>
+      <w:r>
+        <w:rPr>
+          <w:sz w:val="36"/>
+          <w:szCs w:val="36"/>
+        </w:rPr>
+        <w:t xml:space="preserve">is a flow diagram of the PIL human-query interpretation, in which a query is reduced to an Interpretation Frame, intent is disambiguated from context and perspective, an ambiguity gate asks one clarifying question when intent is materially uncertain, a register-and-ergonomic-mode selector sets the reply style and delivery from sourced culture/mores/ergonomics packs, and the existing retrieve-gate-compose pipeline answers from verified Fact Units in that register without altering the facts.</w:t>
+      </w:r>
+    </w:p>
+    <w:p>
+      <w:pPr>
+        <w:pStyle w:val="Normal"/>
+        <w:bidi w:val="0"/>
+        <w:ind w:firstLine="432"/>
+        <w:jc w:val="both"/>
+        <w:rPr>
+          <w:rFonts w:hint="eastAsia"/>
+          <w:sz w:val="36"/>
+          <w:szCs w:val="36"/>
+        </w:rPr>
+      </w:pPr>
+      <w:r>
+        <w:rPr>
+          <w:b/>
+          <w:sz w:val="36"/>
+          <w:szCs w:val="36"/>
+        </w:rPr>
+        <w:t xml:space="preserve">FIG. 39 </w:t>
+      </w:r>
+      <w:r>
+        <w:rPr>
+          <w:sz w:val="36"/>
+          <w:szCs w:val="36"/>
+        </w:rPr>
+        <w:t xml:space="preserve">is a block diagram of the Lecture Query mode ingestion pipeline, in which a live or recorded audio/video program is captured under consent, transcribed and diarized, analyzed by the paralinguistic layer over time and by the language layer for structure and claims, summarized deterministically, and ingested as a Lecture Record whose claims are stored as attributed utterance facts and which is forever-linked to the speaker, venue, event, organization, and date by immutable provenance-tracked, trust-gated identity links.</w:t>
+      </w:r>
+    </w:p>
+    <w:p>
+      <w:pPr>
+        <w:pStyle w:val="Normal"/>
+        <w:bidi w:val="0"/>
+        <w:ind w:firstLine="432"/>
+        <w:jc w:val="both"/>
+        <w:rPr>
+          <w:rFonts w:hint="eastAsia"/>
+          <w:sz w:val="36"/>
+          <w:szCs w:val="36"/>
+        </w:rPr>
+      </w:pPr>
+      <w:r>
+        <w:rPr>
+          <w:b/>
+          <w:sz w:val="36"/>
+          <w:szCs w:val="36"/>
+        </w:rPr>
+        <w:t xml:space="preserve">FIG. 40 </w:t>
+      </w:r>
+      <w:r>
+        <w:rPr>
+          <w:sz w:val="36"/>
+          <w:szCs w:val="36"/>
+        </w:rPr>
+        <w:t xml:space="preserve">is a data-flow diagram of the forever-linked Lecture Record in the Fact-Unit identity graph and its querying, showing the record bound to speaker, venue, event, and organization entities and to the transcript and paralinguistic track, its attributed claims gated as corroborated, contradicted, or open, and a query answered with citations to the record and attribution to the speaker, refused where unknown.</w:t>
+      </w:r>
+    </w:p>
+    <w:p>
+      <w:pPr>
+        <w:pStyle w:val="Normal"/>
+        <w:bidi w:val="0"/>
+        <w:ind w:firstLine="432"/>
+        <w:jc w:val="both"/>
+        <w:rPr>
+          <w:rFonts w:hint="eastAsia"/>
+          <w:sz w:val="36"/>
+          <w:szCs w:val="36"/>
+        </w:rPr>
+      </w:pPr>
+      <w:r>
+        <w:rPr>
+          <w:b/>
+          <w:sz w:val="36"/>
+          <w:szCs w:val="36"/>
+        </w:rPr>
+        <w:t xml:space="preserve">FIG. 41 </w:t>
+      </w:r>
+      <w:r>
+        <w:rPr>
+          <w:sz w:val="36"/>
+          <w:szCs w:val="36"/>
+        </w:rPr>
+        <w:t xml:space="preserve">is a data-flow diagram of deterministic multilingual acquisition without a generative model, in which a per-language learning agent acquires vocabulary, phonology (IPA), and grammatical regularities from a lawful public-domain corpus and a governed bilingual dictionary, an IPA transcription is verified against a reference phonemizer and withheld rather than asserted when verification fails, and each accepted item is written as a provenance-tracked lexical record reproducible from the same inputs, with no large or generative language model in the grounding path.</w:t>
+      </w:r>
+    </w:p>
+    <w:p>
+      <w:pPr>
+        <w:pStyle w:val="Normal"/>
+        <w:bidi w:val="0"/>
+        <w:ind w:firstLine="432"/>
+        <w:jc w:val="both"/>
+        <w:rPr>
+          <w:rFonts w:hint="eastAsia"/>
+          <w:sz w:val="36"/>
+          <w:szCs w:val="36"/>
+        </w:rPr>
+      </w:pPr>
+      <w:r>
+        <w:rPr>
+          <w:b/>
+          <w:sz w:val="36"/>
+          <w:szCs w:val="36"/>
+        </w:rPr>
+        <w:t xml:space="preserve">FIG. 42 </w:t>
+      </w:r>
+      <w:r>
+        <w:rPr>
+          <w:sz w:val="36"/>
+          <w:szCs w:val="36"/>
+        </w:rPr>
+        <w:t xml:space="preserve">is a block diagram of a Dialect Parameter Cluster (DPC), a declared and versioned cluster of phonological, lexical, and orthographic parameters by which an input utterance is attributed to a dialect by a deterministic parameter-match score, the cluster modulating expression only and never altering admission, applicability scope, confidence, or the governed vocabulary.</w:t>
+      </w:r>
+    </w:p>
+    <w:p>
+      <w:pPr>
+        <w:pStyle w:val="Normal"/>
+        <w:bidi w:val="0"/>
+        <w:ind w:firstLine="432"/>
+        <w:jc w:val="both"/>
+        <w:rPr>
+          <w:rFonts w:hint="eastAsia"/>
+          <w:sz w:val="36"/>
+          <w:szCs w:val="36"/>
+        </w:rPr>
+      </w:pPr>
+      <w:r>
+        <w:rPr>
+          <w:b/>
+          <w:sz w:val="36"/>
+          <w:szCs w:val="36"/>
+        </w:rPr>
+        <w:t xml:space="preserve">FIG. 43 </w:t>
+      </w:r>
+      <w:r>
+        <w:rPr>
+          <w:sz w:val="36"/>
+          <w:szCs w:val="36"/>
+        </w:rPr>
+        <w:t xml:space="preserve">is a data-flow diagram of grounded scene compilation to an external generative media engine, in which a grounded scene representation derived from verified Fact Units is compiled and validated into a prompt bundle for an external generative video engine and any returned media is admitted only as a derived artifact marked as a reconstruction and never as a grounding source.</w:t>
+      </w:r>
+    </w:p>
+    <w:p>
+      <w:pPr>
+        <w:pStyle w:val="Normal"/>
+        <w:bidi w:val="0"/>
+        <w:ind w:firstLine="432"/>
+        <w:jc w:val="both"/>
+        <w:rPr>
+          <w:rFonts w:hint="eastAsia"/>
+          <w:sz w:val="36"/>
+          <w:szCs w:val="36"/>
+        </w:rPr>
+      </w:pPr>
+      <w:r>
+        <w:rPr>
+          <w:b/>
+          <w:sz w:val="36"/>
+          <w:szCs w:val="36"/>
+        </w:rPr>
+        <w:t xml:space="preserve">FIG. 44 </w:t>
+      </w:r>
+      <w:r>
+        <w:rPr>
+          <w:sz w:val="36"/>
+          <w:szCs w:val="36"/>
+        </w:rPr>
+        <w:t xml:space="preserve">is a block diagram of key-safe external-service mediation, in which a credential for an external service is held on the server side of the query/presentation boundary and never transmitted to the client, the server performing the external call and serving the result to the client by an opaque cache identifier so that the credential never crosses the boundary.</w:t>
+      </w:r>
+    </w:p>
+    <w:p>
+      <w:pPr>
+        <w:pStyle w:val="Normal"/>
+        <w:bidi w:val="0"/>
+        <w:ind w:firstLine="432"/>
+        <w:jc w:val="both"/>
+        <w:rPr>
+          <w:rFonts w:hint="eastAsia"/>
+          <w:sz w:val="36"/>
+          <w:szCs w:val="36"/>
+        </w:rPr>
+      </w:pPr>
+      <w:r>
+        <w:rPr>
+          <w:b/>
+          <w:sz w:val="36"/>
+          <w:szCs w:val="36"/>
+        </w:rPr>
+        <w:t xml:space="preserve">FIG. 45 </w:t>
+      </w:r>
+      <w:r>
+        <w:rPr>
+          <w:sz w:val="36"/>
+          <w:szCs w:val="36"/>
+        </w:rPr>
+        <w:t xml:space="preserve">is a flow diagram of scene reconstruction from prose, in which a deterministic reconstructor derives a shot sequence, a timed prompt sequence, and pacing and music cues as a bounded reconstruction, renders a participant who is not an identified subject as a silhouette so that no unverified identity is fabricated, and marks the whole as a reconstruction.</w:t>
+      </w:r>
+    </w:p>
+    <w:p>
+      <w:pPr>
+        <w:pStyle w:val="Normal"/>
+        <w:bidi w:val="0"/>
+        <w:ind w:firstLine="432"/>
+        <w:jc w:val="both"/>
+        <w:rPr>
+          <w:rFonts w:hint="eastAsia"/>
+          <w:sz w:val="36"/>
+          <w:szCs w:val="36"/>
+        </w:rPr>
+      </w:pPr>
+      <w:r>
+        <w:rPr>
+          <w:b/>
+          <w:sz w:val="36"/>
+          <w:szCs w:val="36"/>
+        </w:rPr>
+        <w:t xml:space="preserve">FIG. 46 </w:t>
+      </w:r>
+      <w:r>
+        <w:rPr>
+          <w:sz w:val="36"/>
+          <w:szCs w:val="36"/>
+        </w:rPr>
+        <w:t xml:space="preserve">is a block diagram of modular edition packaging, in which the system is deployable as one of a plurality of nested capability editions selected at launch, each edition enabling a declared subset of subsystems while the Prime Directive and the deterministic reasoning core remain invariant across every edition.</w:t>
+      </w:r>
+    </w:p>
+    <w:p>
+      <w:pPr>
+        <w:pStyle w:val="Normal"/>
+        <w:bidi w:val="0"/>
+        <w:ind w:firstLine="432"/>
+        <w:jc w:val="both"/>
+        <w:rPr>
+          <w:rFonts w:hint="eastAsia"/>
+          <w:sz w:val="36"/>
+          <w:szCs w:val="36"/>
+        </w:rPr>
+      </w:pPr>
+      <w:r>
+        <w:rPr>
+          <w:b/>
+          <w:sz w:val="36"/>
+          <w:szCs w:val="36"/>
+        </w:rPr>
+        <w:t xml:space="preserve">FIG. 47 </w:t>
+      </w:r>
+      <w:r>
+        <w:rPr>
+          <w:sz w:val="36"/>
+          <w:szCs w:val="36"/>
+        </w:rPr>
+        <w:t xml:space="preserve">is a block diagram of the version-independent, provenance-continuous store, in which the knowledge store resides at a canonical location independent of the deployment software version so that successive software versions bind to the same provenance-tracked records, a version change never re-initializes the store, and the system refuses to substitute an empty store where a populated store exists.</w:t>
+      </w:r>
+    </w:p>
+    <w:p>
+      <w:pPr>
+        <w:pStyle w:val="Normal"/>
+        <w:bidi w:val="0"/>
+        <w:ind w:firstLine="432"/>
+        <w:jc w:val="both"/>
+        <w:rPr>
+          <w:rFonts w:hint="eastAsia"/>
+          <w:sz w:val="36"/>
+          <w:szCs w:val="36"/>
+        </w:rPr>
+      </w:pPr>
+      <w:r>
+        <w:rPr>
+          <w:b/>
+          <w:sz w:val="36"/>
+          <w:szCs w:val="36"/>
+        </w:rPr>
+        <w:t xml:space="preserve">FIG. 48 </w:t>
+      </w:r>
+      <w:r>
+        <w:rPr>
+          <w:sz w:val="36"/>
+          <w:szCs w:val="36"/>
+        </w:rPr>
+        <w:t xml:space="preserve">is a data-flow diagram of a cited question-and-answer (ChatBot) application embodiment, in which a user question is interpreted for intent and register, answered by Federated Query Language retrieval over verified Fact Units, passed through the Prime-Directive gate, and returned either as a composed answer carrying per-fact citations or, where the evidence is insufficient, as an honest UNKNOWN, the same citation-or-UNKNOWN contract holding when the embodiment is deployed as a ChatBot or assistant surface.</w:t>
+      </w:r>
+    </w:p>
+    <w:p>
+      <w:pPr>
+        <w:pStyle w:val="Normal"/>
+        <w:bidi w:val="0"/>
+        <w:ind w:firstLine="432"/>
+        <w:jc w:val="both"/>
+        <w:rPr>
+          <w:rFonts w:hint="eastAsia"/>
+          <w:sz w:val="36"/>
+          <w:szCs w:val="36"/>
+        </w:rPr>
+      </w:pPr>
+      <w:r>
+        <w:rPr>
+          <w:b/>
+          <w:sz w:val="36"/>
+          <w:szCs w:val="36"/>
+        </w:rPr>
+        <w:t xml:space="preserve">FIG. 49 </w:t>
+      </w:r>
+      <w:r>
+        <w:rPr>
+          <w:sz w:val="36"/>
+          <w:szCs w:val="36"/>
+        </w:rPr>
+        <w:t xml:space="preserve">is a block diagram of the application and deployment surfaces of the system over its invariant core, in which a single governed body of Fact Units is presented through an on-device micro-encapsulated eBook or document question-and-answer surface, a software-as-a-service or application-programming-interface service, a Fact-Unit compressed search engine, a deterministic large-language-model-hybrid adjunct, and a private or offline analysis deployment, each surface inheriting the same citation-or-UNKNOWN contract and provenance and none able to assert a fact the core would refuse.</w:t>
+      </w:r>
+    </w:p>
+    <w:p>
+      <w:pPr>
+        <w:pStyle w:val="Normal"/>
+        <w:bidi w:val="0"/>
+        <w:ind w:firstLine="432"/>
+        <w:jc w:val="both"/>
+        <w:rPr>
+          <w:rFonts w:hint="eastAsia"/>
+          <w:sz w:val="36"/>
+          <w:szCs w:val="36"/>
+        </w:rPr>
+      </w:pPr>
+      <w:r>
+        <w:rPr>
+          <w:b/>
+          <w:sz w:val="36"/>
+          <w:szCs w:val="36"/>
+        </w:rPr>
+        <w:t xml:space="preserve">FIG. 50 </w:t>
+      </w:r>
+      <w:r>
+        <w:rPr>
+          <w:sz w:val="36"/>
+          <w:szCs w:val="36"/>
+        </w:rPr>
+        <w:t xml:space="preserve">is a block diagram of Open Claw ingestion, showing content-based format detection, archive bounds, the Artifact Segmenter, the instruction-like content screen, the OpenClaw Interpreter, and the admission of artifact-description, structured, passage, and flagged untrusted records to the Fact Unit store under a provenance seal.</w:t>
+      </w:r>
+    </w:p>
+    <w:p>
+      <w:pPr>
+        <w:pStyle w:val="Normal"/>
+        <w:bidi w:val="0"/>
+        <w:ind w:firstLine="432"/>
+        <w:jc w:val="both"/>
+        <w:rPr>
+          <w:rFonts w:hint="eastAsia"/>
+          <w:sz w:val="36"/>
+          <w:szCs w:val="36"/>
+        </w:rPr>
+      </w:pPr>
+      <w:r>
+        <w:rPr>
+          <w:b/>
+          <w:sz w:val="36"/>
+          <w:szCs w:val="36"/>
+        </w:rPr>
+        <w:t xml:space="preserve">FIG. 51 </w:t>
+      </w:r>
+      <w:r>
+        <w:rPr>
+          <w:sz w:val="36"/>
+          <w:szCs w:val="36"/>
+        </w:rPr>
+        <w:t xml:space="preserve">is a block diagram of on-chain certification, showing a QueryBook object and its local provenance seal, the content hash and on-chain metadata, the in-system transaction signer and network guard, the certificate contract on a public blockchain, the independent verifier, and the licence check.</w:t>
+      </w:r>
+    </w:p>
+    <w:p>
+      <w:pPr>
+        <w:pStyle w:val="Normal"/>
+        <w:bidi w:val="0"/>
+        <w:ind w:firstLine="432"/>
+        <w:jc w:val="both"/>
+        <w:rPr>
+          <w:rFonts w:hint="eastAsia"/>
+          <w:sz w:val="36"/>
+          <w:szCs w:val="36"/>
+        </w:rPr>
+      </w:pPr>
+      <w:r>
+        <w:rPr>
+          <w:b/>
+          <w:sz w:val="36"/>
+          <w:szCs w:val="36"/>
+        </w:rPr>
+        <w:t xml:space="preserve">FIG. 52 </w:t>
+      </w:r>
+      <w:r>
+        <w:rPr>
+          <w:sz w:val="36"/>
+          <w:szCs w:val="36"/>
+        </w:rPr>
+        <w:t xml:space="preserve">is a block diagram of the agent protection and deception layer, showing the HTTP gate, the isolation register, the Agent Gateway, the deception check with honeycode, honeytokens, tripwires, and honeypot agents, the AI-aware firewall and anomaly detector, the security event bus, the decoy environment, the engagement recorder, and operator-only release.</w:t>
+      </w:r>
+    </w:p>
+    <w:p>
+      <w:pPr>
+        <w:pStyle w:val="Normal"/>
+        <w:bidi w:val="0"/>
+        <w:ind w:firstLine="432"/>
+        <w:jc w:val="both"/>
+        <w:rPr>
+          <w:rFonts w:hint="eastAsia"/>
+          <w:sz w:val="36"/>
+          <w:szCs w:val="36"/>
+        </w:rPr>
+      </w:pPr>
+      <w:r>
+        <w:rPr>
+          <w:b/>
+          <w:sz w:val="36"/>
+          <w:szCs w:val="36"/>
+        </w:rPr>
+        <w:t xml:space="preserve">FIG. 53 </w:t>
+      </w:r>
+      <w:r>
+        <w:rPr>
+          <w:sz w:val="36"/>
+          <w:szCs w:val="36"/>
+        </w:rPr>
+        <w:t xml:space="preserve">is a block diagram of the tamper-evident security record, showing append-only entries, the hash chain, write-once signed Merkle checkpoints, a mirror on a second device, a blockchain anchor, the recompute-from-content verifier with inclusion proofs, and the assurance report.</w:t>
+      </w:r>
+    </w:p>
+    <w:p>
+      <w:pPr>
+        <w:pStyle w:val="Normal"/>
+        <w:bidi w:val="0"/>
+        <w:ind w:firstLine="432"/>
+        <w:jc w:val="both"/>
+        <w:rPr>
+          <w:rFonts w:hint="eastAsia"/>
+          <w:sz w:val="36"/>
+          <w:szCs w:val="36"/>
+        </w:rPr>
+      </w:pPr>
+      <w:r>
+        <w:rPr>
+          <w:b/>
+          <w:sz w:val="36"/>
+          <w:szCs w:val="36"/>
+        </w:rPr>
+        <w:t xml:space="preserve">FIG. 54 </w:t>
+      </w:r>
+      <w:r>
+        <w:rPr>
+          <w:sz w:val="36"/>
+          <w:szCs w:val="36"/>
+        </w:rPr>
+        <w:t xml:space="preserve">is a block diagram of agent interoperability, showing an external AI agent and its skill definition, the Model Context Protocol tool server, the tool-to-command mapping, the Agent Gateway with the agent’s allow-list, grounded handlers, and isolation upon a reserved command.</w:t>
+      </w:r>
+    </w:p>
+    <w:p>
+      <w:pPr>
+        <w:pStyle w:val="Normal"/>
+        <w:bidi w:val="0"/>
+        <w:ind w:firstLine="432"/>
+        <w:jc w:val="both"/>
+        <w:rPr>
+          <w:rFonts w:hint="eastAsia"/>
+          <w:sz w:val="36"/>
+          <w:szCs w:val="36"/>
+        </w:rPr>
+      </w:pPr>
+      <w:r>
+        <w:rPr>
+          <w:b/>
+          <w:sz w:val="36"/>
+          <w:szCs w:val="36"/>
+        </w:rPr>
+        <w:t xml:space="preserve">FIG. 55 </w:t>
+      </w:r>
+      <w:r>
+        <w:rPr>
+          <w:sz w:val="36"/>
+          <w:szCs w:val="36"/>
+        </w:rPr>
+        <w:t xml:space="preserve">is a block diagram of the framed hybrid transport, extending FIG. 25, showing per-type compression, the frame with its header, metadata, payload, CRC32 checksum, and optional signature, the control, normal, and bulk lanes, the receiver, package rebuild with manifest check, and record verification into the Fact Unit store.</w:t>
+      </w:r>
+    </w:p>
+    <w:p>
+      <w:pPr>
+        <w:pStyle w:val="Normal"/>
+        <w:bidi w:val="0"/>
+        <w:spacing w:before="200" w:after="160"/>
+        <w:jc w:val="start"/>
+        <w:rPr>
+          <w:rFonts w:hint="eastAsia"/>
+          <w:sz w:val="36"/>
+          <w:szCs w:val="36"/>
+        </w:rPr>
+      </w:pPr>
+      <w:r>
+        <w:rPr>
           <w:rStyle w:val="Strong"/>
           <w:i/>
           <w:color w:val="555555"/>
           <w:sz w:val="36"/>
           <w:szCs w:val="36"/>
         </w:rPr>
-        <w:t>[Drafting note: professional line-art drawings for FIG. 1–4, 6, 12–13, and 17–18 are provided in the accompanying drawings PDF; FIG. 5, 7–11, and 14–16 are described above and their drawings are prepared to the same standard. Reference numerals follow the specification's element register. No performance, efficiency, or financial figures are asserted in the drawings.]</w:t>
-      </w:r>
-    </w:p>
-    <w:p>
-      <w:pPr>
-        <w:pStyle w:val="Normal"/>
-        <w:bidi w:val="0"/>
-        <w:spacing w:before="200" w:after="160"/>
-        <w:jc w:val="start"/>
-        <w:rPr>
-          <w:rFonts w:hint="eastAsia"/>
+        <w:t xml:space="preserve">[Drafting note: professional line-art drawings for FIG. </w:t>
+      </w:r>
+      <w:r>
+        <w:rPr>
+          <w:rStyle w:val="Strong"/>
+          <w:i/>
+          <w:color w:val="555555"/>
           <w:sz w:val="36"/>
           <w:szCs w:val="36"/>
         </w:rPr>
-      </w:pPr>
+        <w:t xml:space="preserve">9</w:t>
+      </w:r>
       <w:r>
         <w:rPr>
           <w:rStyle w:val="Strong"/>
@@ -7406,7 +8271,250 @@
           <w:sz w:val="36"/>
           <w:szCs w:val="36"/>
         </w:rPr>
-        <w:t xml:space="preserve">[Drafting note: line-art drawings for FIG. 19–24 are provided in the accompanying drawings PDF for FIG. 19–24 and are prepared to the same standard; reference numerals 5000–5550 used in FIG. 19–24 are identified in the Detailed Description.]</w:t>
+        <w:t xml:space="preserve">–</w:t>
+      </w:r>
+      <w:r>
+        <w:rPr>
+          <w:rStyle w:val="Strong"/>
+          <w:i/>
+          <w:color w:val="555555"/>
+          <w:sz w:val="36"/>
+          <w:szCs w:val="36"/>
+        </w:rPr>
+        <w:t xml:space="preserve">12</w:t>
+      </w:r>
+      <w:r>
+        <w:rPr>
+          <w:rStyle w:val="Strong"/>
+          <w:i/>
+          <w:color w:val="555555"/>
+          <w:sz w:val="36"/>
+          <w:szCs w:val="36"/>
+        </w:rPr>
+        <w:t xml:space="preserve">, </w:t>
+      </w:r>
+      <w:r>
+        <w:rPr>
+          <w:rStyle w:val="Strong"/>
+          <w:i/>
+          <w:color w:val="555555"/>
+          <w:sz w:val="36"/>
+          <w:szCs w:val="36"/>
+        </w:rPr>
+        <w:t xml:space="preserve">14</w:t>
+      </w:r>
+      <w:r>
+        <w:rPr>
+          <w:rStyle w:val="Strong"/>
+          <w:i/>
+          <w:color w:val="555555"/>
+          <w:sz w:val="36"/>
+          <w:szCs w:val="36"/>
+        </w:rPr>
+        <w:t xml:space="preserve">, </w:t>
+      </w:r>
+      <w:r>
+        <w:rPr>
+          <w:rStyle w:val="Strong"/>
+          <w:i/>
+          <w:color w:val="555555"/>
+          <w:sz w:val="36"/>
+          <w:szCs w:val="36"/>
+        </w:rPr>
+        <w:t xml:space="preserve">20</w:t>
+      </w:r>
+      <w:r>
+        <w:rPr>
+          <w:rStyle w:val="Strong"/>
+          <w:i/>
+          <w:color w:val="555555"/>
+          <w:sz w:val="36"/>
+          <w:szCs w:val="36"/>
+        </w:rPr>
+        <w:t xml:space="preserve">–</w:t>
+      </w:r>
+      <w:r>
+        <w:rPr>
+          <w:rStyle w:val="Strong"/>
+          <w:i/>
+          <w:color w:val="555555"/>
+          <w:sz w:val="36"/>
+          <w:szCs w:val="36"/>
+        </w:rPr>
+        <w:t xml:space="preserve">21</w:t>
+      </w:r>
+      <w:r>
+        <w:rPr>
+          <w:rStyle w:val="Strong"/>
+          <w:i/>
+          <w:color w:val="555555"/>
+          <w:sz w:val="36"/>
+          <w:szCs w:val="36"/>
+        </w:rPr>
+        <w:t xml:space="preserve">, and </w:t>
+      </w:r>
+      <w:r>
+        <w:rPr>
+          <w:rStyle w:val="Strong"/>
+          <w:i/>
+          <w:color w:val="555555"/>
+          <w:sz w:val="36"/>
+          <w:szCs w:val="36"/>
+        </w:rPr>
+        <w:t xml:space="preserve">25</w:t>
+      </w:r>
+      <w:r>
+        <w:rPr>
+          <w:rStyle w:val="Strong"/>
+          <w:i/>
+          <w:color w:val="555555"/>
+          <w:sz w:val="36"/>
+          <w:szCs w:val="36"/>
+        </w:rPr>
+        <w:t xml:space="preserve">–</w:t>
+      </w:r>
+      <w:r>
+        <w:rPr>
+          <w:rStyle w:val="Strong"/>
+          <w:i/>
+          <w:color w:val="555555"/>
+          <w:sz w:val="36"/>
+          <w:szCs w:val="36"/>
+        </w:rPr>
+        <w:t xml:space="preserve">26</w:t>
+      </w:r>
+      <w:r>
+        <w:rPr>
+          <w:rStyle w:val="Strong"/>
+          <w:i/>
+          <w:color w:val="555555"/>
+          <w:sz w:val="36"/>
+          <w:szCs w:val="36"/>
+        </w:rPr>
+        <w:t xml:space="preserve"> are provided in the accompanying drawings PDF; FIG. </w:t>
+      </w:r>
+      <w:r>
+        <w:rPr>
+          <w:rStyle w:val="Strong"/>
+          <w:i/>
+          <w:color w:val="555555"/>
+          <w:sz w:val="36"/>
+          <w:szCs w:val="36"/>
+        </w:rPr>
+        <w:t xml:space="preserve">13</w:t>
+      </w:r>
+      <w:r>
+        <w:rPr>
+          <w:rStyle w:val="Strong"/>
+          <w:i/>
+          <w:color w:val="555555"/>
+          <w:sz w:val="36"/>
+          <w:szCs w:val="36"/>
+        </w:rPr>
+        <w:t xml:space="preserve">, </w:t>
+      </w:r>
+      <w:r>
+        <w:rPr>
+          <w:rStyle w:val="Strong"/>
+          <w:i/>
+          <w:color w:val="555555"/>
+          <w:sz w:val="36"/>
+          <w:szCs w:val="36"/>
+        </w:rPr>
+        <w:t xml:space="preserve">15</w:t>
+      </w:r>
+      <w:r>
+        <w:rPr>
+          <w:rStyle w:val="Strong"/>
+          <w:i/>
+          <w:color w:val="555555"/>
+          <w:sz w:val="36"/>
+          <w:szCs w:val="36"/>
+        </w:rPr>
+        <w:t xml:space="preserve">–</w:t>
+      </w:r>
+      <w:r>
+        <w:rPr>
+          <w:rStyle w:val="Strong"/>
+          <w:i/>
+          <w:color w:val="555555"/>
+          <w:sz w:val="36"/>
+          <w:szCs w:val="36"/>
+        </w:rPr>
+        <w:t xml:space="preserve">19</w:t>
+      </w:r>
+      <w:r>
+        <w:rPr>
+          <w:rStyle w:val="Strong"/>
+          <w:i/>
+          <w:color w:val="555555"/>
+          <w:sz w:val="36"/>
+          <w:szCs w:val="36"/>
+        </w:rPr>
+        <w:t xml:space="preserve">, and </w:t>
+      </w:r>
+      <w:r>
+        <w:rPr>
+          <w:rStyle w:val="Strong"/>
+          <w:i/>
+          <w:color w:val="555555"/>
+          <w:sz w:val="36"/>
+          <w:szCs w:val="36"/>
+        </w:rPr>
+        <w:t xml:space="preserve">22</w:t>
+      </w:r>
+      <w:r>
+        <w:rPr>
+          <w:rStyle w:val="Strong"/>
+          <w:i/>
+          <w:color w:val="555555"/>
+          <w:sz w:val="36"/>
+          <w:szCs w:val="36"/>
+        </w:rPr>
+        <w:t xml:space="preserve">–</w:t>
+      </w:r>
+      <w:r>
+        <w:rPr>
+          <w:rStyle w:val="Strong"/>
+          <w:i/>
+          <w:color w:val="555555"/>
+          <w:sz w:val="36"/>
+          <w:szCs w:val="36"/>
+        </w:rPr>
+        <w:t xml:space="preserve">24</w:t>
+      </w:r>
+      <w:r>
+        <w:rPr>
+          <w:rStyle w:val="Strong"/>
+          <w:i/>
+          <w:color w:val="555555"/>
+          <w:sz w:val="36"/>
+          <w:szCs w:val="36"/>
+        </w:rPr>
+        <w:t xml:space="preserve"> are described above and their drawings are prepared to the same standard. Reference numerals follow the specification's element register. No performance, efficiency, or financial figures are asserted in the drawings.]</w:t>
+      </w:r>
+    </w:p>
+    <w:p>
+      <w:pPr>
+        <w:pStyle w:val="Normal"/>
+        <w:bidi w:val="0"/>
+        <w:spacing w:before="200" w:after="160"/>
+        <w:jc w:val="start"/>
+        <w:rPr>
+          <w:rFonts w:hint="eastAsia"/>
+          <w:sz w:val="36"/>
+          <w:szCs w:val="36"/>
+        </w:rPr>
+      </w:pPr>
+      <w:r>
+        <w:rPr>
+          <w:rStyle w:val="Strong"/>
+          <w:i/>
+          <w:color w:val="555555"/>
+          <w:sz w:val="36"/>
+          <w:szCs w:val="36"/>
+        </w:rPr>
+        <w:t xml:space="preserve">[Drafting note: the complete drawing set, FIG. 1–55, is provided in the accompanying drawings PDF; reference numerals 5000–5550 used in FIG. 50–55 are identified in the Detailed Description.]</w:t>
       </w:r>
     </w:p>
     <w:p>
@@ -13020,7 +14128,7 @@
           <w:rFonts w:ascii="Times New Roman" w:hAnsi="Times New Roman"/>
           <w:b/>
         </w:rPr>
-        <w:t xml:space="preserve">Open Claw ingestion (FIG. 19). </w:t>
+        <w:t xml:space="preserve">Open Claw ingestion (FIG. 50). </w:t>
       </w:r>
       <w:r>
         <w:rPr>
@@ -13044,7 +14152,7 @@
           <w:rFonts w:ascii="Times New Roman" w:hAnsi="Times New Roman"/>
           <w:b/>
         </w:rPr>
-        <w:t xml:space="preserve">On-chain certification (FIG. 20). </w:t>
+        <w:t xml:space="preserve">On-chain certification (FIG. 51). </w:t>
       </w:r>
       <w:r>
         <w:rPr>
@@ -13068,7 +14176,7 @@
           <w:rFonts w:ascii="Times New Roman" w:hAnsi="Times New Roman"/>
           <w:b/>
         </w:rPr>
-        <w:t xml:space="preserve">Agent protection and deception (FIG. 21). </w:t>
+        <w:t xml:space="preserve">Agent protection and deception (FIG. 52). </w:t>
       </w:r>
       <w:r>
         <w:rPr>
@@ -13092,13 +14200,13 @@
           <w:rFonts w:ascii="Times New Roman" w:hAnsi="Times New Roman"/>
           <w:b/>
         </w:rPr>
-        <w:t xml:space="preserve">Tamper-evident security record (FIG. 22). </w:t>
-      </w:r>
-      <w:r>
-        <w:rPr>
-          <w:rFonts w:ascii="Times New Roman" w:hAnsi="Times New Roman"/>
-        </w:rPr>
-        <w:t xml:space="preserve">Each security decision (5300) is written as an append-only entry (5310) recording agent, caller, session, command, a parameter hash, the decision, and flags, with no update or delete interface. Each entry hash commits to its predecessor (5320). Every N entries and on demand, a Merkle checkpoint (5330) is created exclusively, never overwritten, signed under the deployment key, and chained to the previous checkpoint; it may be copied to a mirror on a second device (5340) and its root anchored on a public blockchain through the certificate contract of FIG. 20 (5350). A verifier (5360) recomputes every entry and root from content, never trusting a stored hash, and produces a Merkle inclusion proof per entry, and an assurance report (5370) states which protections a record possesses. The record extends, and does not replace, the post-quantum provenance ledger.</w:t>
+        <w:t xml:space="preserve">Tamper-evident security record (FIG. 53). </w:t>
+      </w:r>
+      <w:r>
+        <w:rPr>
+          <w:rFonts w:ascii="Times New Roman" w:hAnsi="Times New Roman"/>
+        </w:rPr>
+        <w:t xml:space="preserve">Each security decision (5300) is written as an append-only entry (5310) recording agent, caller, session, command, a parameter hash, the decision, and flags, with no update or delete interface. Each entry hash commits to its predecessor (5320). Every N entries and on demand, a Merkle checkpoint (5330) is created exclusively, never overwritten, signed under the deployment key, and chained to the previous checkpoint; it may be copied to a mirror on a second device (5340) and its root anchored on a public blockchain through the certificate contract of FIG. 51 (5350). A verifier (5360) recomputes every entry and root from content, never trusting a stored hash, and produces a Merkle inclusion proof per entry, and an assurance report (5370) states which protections a record possesses. The record extends, and does not replace, the post-quantum provenance ledger.</w:t>
       </w:r>
     </w:p>
     <w:p>
@@ -13116,7 +14224,7 @@
           <w:rFonts w:ascii="Times New Roman" w:hAnsi="Times New Roman"/>
           <w:b/>
         </w:rPr>
-        <w:t xml:space="preserve">Agent interoperability (FIG. 23). </w:t>
+        <w:t xml:space="preserve">Agent interoperability (FIG. 54). </w:t>
       </w:r>
       <w:r>
         <w:rPr>
@@ -13140,13 +14248,13 @@
           <w:rFonts w:ascii="Times New Roman" w:hAnsi="Times New Roman"/>
           <w:b/>
         </w:rPr>
-        <w:t xml:space="preserve">Framed hybrid transport (FIG. 24). </w:t>
-      </w:r>
-      <w:r>
-        <w:rPr>
-          <w:rFonts w:ascii="Times New Roman" w:hAnsi="Times New Roman"/>
-        </w:rPr>
-        <w:t xml:space="preserve">Extending the protocol of FIG. 17, a producer node (5500) applies per-type compression (5510) — record batches by a dictionary primed with record field names, media by a standard codec left unaltered — and packs the result into frames (5520) comprising a 32-byte header (5521), metadata (5522), payload (5523), a CRC32 checksum (5524), and an optional signature (5525). Frames travel on a control lane (5530), a normal lane (5531), and a bulk lane (5532), each with its own connection, rate limit, and receipt window, so a bulk transfer cannot hold a control message or a live stream behind it. The receiver (5541) drops a frame failing plausibility, checksum, or signature checks and resynchronizes at the next marker; media is rebuilt into HLS, MPEG-DASH, or RTMP packages with a manifest check (5543), and records pass verification into the Fact Unit store (5550). The transport neither enlarges nor alters a compressed asset.</w:t>
+        <w:t xml:space="preserve">Framed hybrid transport (FIG. 55). </w:t>
+      </w:r>
+      <w:r>
+        <w:rPr>
+          <w:rFonts w:ascii="Times New Roman" w:hAnsi="Times New Roman"/>
+        </w:rPr>
+        <w:t xml:space="preserve">Extending the protocol of FIG. 25, a producer node (5500) applies per-type compression (5510) — record batches by a dictionary primed with record field names, media by a standard codec left unaltered — and packs the result into frames (5520) comprising a 32-byte header (5521), metadata (5522), payload (5523), a CRC32 checksum (5524), and an optional signature (5525). Frames travel on a control lane (5530), a normal lane (5531), and a bulk lane (5532), each with its own connection, rate limit, and receipt window, so a bulk transfer cannot hold a control message or a live stream behind it. The receiver (5541) drops a frame failing plausibility, checksum, or signature checks and resynchronizes at the next marker; media is rebuilt into HLS, MPEG-DASH, or RTMP packages with a manifest check (5543), and records pass verification into the Fact Unit store (5550). The transport neither enlarges nor alters a compressed asset.</w:t>
       </w:r>
     </w:p>
     <w:p>
@@ -13170,7 +14278,7 @@
         <w:rPr>
           <w:rFonts w:ascii="Times New Roman" w:hAnsi="Times New Roman"/>
         </w:rPr>
-        <w:t xml:space="preserve">The features of FIG. 19–24 are implemented in QueryBook prototype version 9.64 and exercised by automated self-tests, including a sandboxed attack trial against the gateway and decoy and certificate minting, lineage, revocation, and verification on a local test chain; deterministic record-grounded colorization has additionally been implemented in a laboratory prototype at 1K, 4K, and 16K frame sizes.</w:t>
+        <w:t xml:space="preserve">The features of FIG. 50–55 are implemented in QueryBook prototype version 9.64 and exercised by automated self-tests, including a sandboxed attack trial against the gateway and decoy and certificate minting, lineage, revocation, and verification on a local test chain; deterministic record-grounded colorization has additionally been implemented in a laboratory prototype at 1K, 4K, and 16K frame sizes.</w:t>
       </w:r>
     </w:p>
     <w:p>

</xml_diff>

<commit_message>
Synchronize drawings and application: FIG. 1-55 in sequential order
Drawings renumbered to the application's own order (its FIG. 1-18
unchanged), one figure per sheet, Sheet N of 55. Application restored
to the user's original FIG. 1-18 text; brief descriptions for FIG.
19-55 added after FIG. 18 in sequence. All 908 original paragraphs
verified byte-identical. Superseded drawing files removed.

Co-Authored-By: Claude Opus 5.5 <noreply@anthropic.com>
Claude-Session: https://claude.ai/code/session_01GUsCZvcCggQTPFctneB6J4
</commit_message>
<xml_diff>
--- a/querybook/patent/final_update/Final_Update_AMENDED_clean.docx
+++ b/querybook/patent/final_update/Final_Update_AMENDED_clean.docx
@@ -6716,7 +6716,7 @@
           <w:sz w:val="36"/>
           <w:szCs w:val="36"/>
         </w:rPr>
-        <w:t xml:space="preserve">is a block diagram of the overall QueryBook Language Expression Layer (LEL) system architecture.</w:t>
+        <w:t>is a block diagram of the system, showing the ingestion pipeline, the storage engine, the UFCS substrate, the FQL query engine, the verification ledger, and the federation boundary.</w:t>
       </w:r>
     </w:p>
     <w:p>
@@ -6744,7 +6744,7 @@
           <w:sz w:val="36"/>
           <w:szCs w:val="36"/>
         </w:rPr>
-        <w:t xml:space="preserve">is a block diagram of the Sub-Language Priming Layer (SLPL) and the measurable representation produced by each of its six components.</w:t>
+        <w:t>is a diagram of a Fact Atom carried within a Fact Envelope, showing the nucleus, group classification, polarity, and links of the atom, together with the envelope's confidence, provenance, certification, and content-derived identifier.</w:t>
       </w:r>
     </w:p>
     <w:p>
@@ -6772,7 +6772,7 @@
           <w:sz w:val="36"/>
           <w:szCs w:val="36"/>
         </w:rPr>
-        <w:t xml:space="preserve">is a flow diagram of the developmental learning sequence and the one-way Transition Gate having four readiness thresholds.</w:t>
+        <w:t>is a diagram of a fact-certification authority hierarchy, showing a root trust anchor, domain authorities, and the certified facts and trust scores derived beneath them.</w:t>
       </w:r>
     </w:p>
     <w:p>
@@ -6800,7 +6800,7 @@
           <w:sz w:val="36"/>
           <w:szCs w:val="36"/>
         </w:rPr>
-        <w:t xml:space="preserve">is a block diagram of the multilingual Delta Acquisition Model and the acquisition acceleration flywheel.</w:t>
+        <w:t>is a diagram of the substrate relationships, showing a pairwise graph, a hyperedge, and a directed hyperchain among Fact Units.</w:t>
       </w:r>
     </w:p>
     <w:p>
@@ -6828,7 +6828,7 @@
           <w:sz w:val="36"/>
           <w:szCs w:val="36"/>
         </w:rPr>
-        <w:t xml:space="preserve">is a block diagram of the seven-stage Speech Output Pipeline.</w:t>
+        <w:t>is a diagram supporting claim 11, showing tour/exhibition sequencing of immersive scenes into ordered waypoints.</w:t>
       </w:r>
     </w:p>
     <w:p>
@@ -6856,7 +6856,7 @@
           <w:sz w:val="36"/>
           <w:szCs w:val="36"/>
         </w:rPr>
-        <w:t xml:space="preserve">is a data-flow diagram of the co-grounded integration of the LEL with the Federated Query Language (FQL) and the Universal Federated Connectivity System (UFCS).</w:t>
+        <w:t>is a diagram of a query that filters jointly on fact structure and certification trust, and of the trust-native execution by propagation, branch-and-bound pruning, and contradiction exclusion.</w:t>
       </w:r>
     </w:p>
     <w:p>
@@ -6884,7 +6884,7 @@
           <w:sz w:val="36"/>
           <w:szCs w:val="36"/>
         </w:rPr>
-        <w:t xml:space="preserve">is a block diagram of a reduced-to-practice embodiment (the Language Lab) implementing Phase One, the Transition Gate, and a deterministic Phase Two.</w:t>
+        <w:t>is a flowchart of verifying machine-generated text against certified records, classifying each assertion as verified, contradicted, or unknown.</w:t>
       </w:r>
     </w:p>
     <w:p>
@@ -6912,7 +6912,7 @@
           <w:sz w:val="36"/>
           <w:szCs w:val="36"/>
         </w:rPr>
-        <w:t xml:space="preserve">is a data-flow diagram of the deterministic Phase-Two semantic grounding of the reduced-to-practice embodiment, in which word meanings are attached only from auditable sources — a bundled public-domain dictionary and self-grounding against verified Fact Units in the store — with any large-language-model meaning source excluded from the grounding path.</w:t>
+        <w:t>is a diagram of federation, showing a certified envelope crossing a boundary and being re-validated on the receiving side.</w:t>
       </w:r>
     </w:p>
     <w:p>
@@ -6940,7 +6940,7 @@
           <w:sz w:val="36"/>
           <w:szCs w:val="36"/>
         </w:rPr>
-        <w:t>is a block diagram of the system, showing the ingestion pipeline, the storage engine, the UFCS substrate, the FQL query engine, the verification ledger, and the federation boundary.</w:t>
+        <w:t>is a diagram of fact-level erasure using an externally held key (cryptographic shredding of a sealed payload).</w:t>
       </w:r>
     </w:p>
     <w:p>
@@ -6968,7 +6968,7 @@
           <w:sz w:val="36"/>
           <w:szCs w:val="36"/>
         </w:rPr>
-        <w:t>is a diagram of a Fact Atom carried within a Fact Envelope, showing the nucleus, group classification, polarity, and links of the atom, together with the envelope's confidence, provenance, certification, and content-derived identifier.</w:t>
+        <w:t>is a diagram of the Universal Security Architecture, showing the twelve defensive layers, the five simultaneous defensive postures, and key mechanisms including the AI Attack Prediction Engine.</w:t>
       </w:r>
     </w:p>
     <w:p>
@@ -6996,7 +6996,7 @@
           <w:sz w:val="36"/>
           <w:szCs w:val="36"/>
         </w:rPr>
-        <w:t>is a diagram of a fact-certification authority hierarchy, showing a root trust anchor, domain authorities, and the certified facts and trust scores derived beneath them.</w:t>
+        <w:t>is a diagram of Universal Honeypot Saturation and the Data Firehose, showing port saturation via the Phantom Port Daemon and application-entry-point saturation via the Shadow-App mechanism.</w:t>
       </w:r>
     </w:p>
     <w:p>
@@ -7024,7 +7024,7 @@
           <w:sz w:val="36"/>
           <w:szCs w:val="36"/>
         </w:rPr>
-        <w:t>is a diagram of the substrate relationships, showing a pairwise graph, a hyperedge, and a directed hyperchain among Fact Units.</w:t>
+        <w:t>is a diagram of the five deployment topologies — cloud SaaS, local server, hybrid, single-device, and edge — over the invariant common layer of safety, governance, and provenance.</w:t>
       </w:r>
     </w:p>
     <w:p>
@@ -7052,7 +7052,7 @@
           <w:sz w:val="36"/>
           <w:szCs w:val="36"/>
         </w:rPr>
-        <w:t>is a diagram supporting claim 11, showing tour/exhibition sequencing of immersive scenes into ordered waypoints.</w:t>
+        <w:t>is a diagram of the Adaptive Response Engine, showing the five-stage pipeline from Result-Set Analysis through Generation-Directive Assembly, with the directive fixed before generation begins.</w:t>
       </w:r>
     </w:p>
     <w:p>
@@ -7080,7 +7080,7 @@
           <w:sz w:val="36"/>
           <w:szCs w:val="36"/>
         </w:rPr>
-        <w:t>is a diagram of a query that filters jointly on fact structure and certification trust, and of the trust-native execution by propagation, branch-and-bound pruning, and contradiction exclusion.</w:t>
+        <w:t>is a diagram of the user-owned agent system, showing Blueprint definition and registration, Agent-Instance creation under commissioner-bounded authority, and the governance evaluation at each action.</w:t>
       </w:r>
     </w:p>
     <w:p>
@@ -7108,7 +7108,7 @@
           <w:sz w:val="36"/>
           <w:szCs w:val="36"/>
         </w:rPr>
-        <w:t>is a flowchart of verifying machine-generated text against certified records, classifying each assertion as verified, contradicted, or unknown.</w:t>
+        <w:t>is a diagram of deterministic multi-language regeneration, showing source ingestion to Fact Units, the language-independent Fact Unit graph as a single knowledge source, and regeneration into any target language.</w:t>
       </w:r>
     </w:p>
     <w:p>
@@ -7136,7 +7136,7 @@
           <w:sz w:val="36"/>
           <w:szCs w:val="36"/>
         </w:rPr>
-        <w:t>is a diagram of federation, showing a certified envelope crossing a boundary and being re-validated on the receiving side.</w:t>
+        <w:t>is a diagram of semantic compression, expansion, colorization, and resolution upscaling, showing the meaning-storage compression flow and the on-demand regeneration of a surface representation.</w:t>
       </w:r>
     </w:p>
     <w:p>
@@ -7164,7 +7164,7 @@
           <w:sz w:val="36"/>
           <w:szCs w:val="36"/>
         </w:rPr>
-        <w:t>is a diagram of fact-level erasure using an externally held key (cryptographic shredding of a sealed payload).</w:t>
+        <w:t>is a diagram of the QueryBook-enhanced TCP/IP hybrid protocol packet, showing the optional semantic-metadata header carrying FUID, ProvenanceRef, and confidence fields alongside the standard headers and payload.</w:t>
       </w:r>
     </w:p>
     <w:p>
@@ -7192,7 +7192,7 @@
           <w:sz w:val="36"/>
           <w:szCs w:val="36"/>
         </w:rPr>
-        <w:t>is a diagram of the Universal Security Architecture, showing the twelve defensive layers, the five simultaneous defensive postures, and key mechanisms including the AI Attack Prediction Engine.</w:t>
+        <w:t>is a diagram of the Neuromorphic Cognitive Layer and attractor network, showing the energy function, the capacity ceiling, and convergence to a stable equilibrium.</w:t>
       </w:r>
     </w:p>
     <w:p>
@@ -7220,7 +7220,7 @@
           <w:sz w:val="36"/>
           <w:szCs w:val="36"/>
         </w:rPr>
-        <w:t>is a diagram of Universal Honeypot Saturation and the Data Firehose, showing port saturation via the Phantom Port Daemon and application-entry-point saturation via the Shadow-App mechanism.</w:t>
+        <w:t xml:space="preserve">is a diagram of the Fact Unit confidence and evidence model, comprising an evidence pair, a Beta posterior, a score, a credible interval, source diversity, temporal decay, and a confidence trend.</w:t>
       </w:r>
     </w:p>
     <w:p>
@@ -7248,7 +7248,7 @@
           <w:sz w:val="36"/>
           <w:szCs w:val="36"/>
         </w:rPr>
-        <w:t>is a diagram of the five deployment topologies — cloud SaaS, local server, hybrid, single-device, and edge — over the invariant common layer of safety, governance, and provenance.</w:t>
+        <w:t xml:space="preserve">is a diagram of the UFCS packet structure, showing the fields of a serialized Fact Unit record and an exemplar packet.</w:t>
       </w:r>
     </w:p>
     <w:p>
@@ -7276,7 +7276,7 @@
           <w:sz w:val="36"/>
           <w:szCs w:val="36"/>
         </w:rPr>
-        <w:t>is a diagram of the Adaptive Response Engine, showing the five-stage pipeline from Result-Set Analysis through Generation-Directive Assembly, with the directive fixed before generation begins.</w:t>
+        <w:t xml:space="preserve">is a diagram of UFCS packet framing, in which immutable packets are de-duplicated by fingerprint and appended to content-addressed blocks under a fingerprint index.</w:t>
       </w:r>
     </w:p>
     <w:p>
@@ -7304,7 +7304,7 @@
           <w:sz w:val="36"/>
           <w:szCs w:val="36"/>
         </w:rPr>
-        <w:t>is a diagram of the user-owned agent system, showing Blueprint definition and registration, Agent-Instance creation under commissioner-bounded authority, and the governance evaluation at each action.</w:t>
+        <w:t xml:space="preserve">is a diagram of FQL query anatomy with a worked example, in which match, where, exclude, rank, and return clauses produce a highest-trust answer bound to its evidence by a provenance hash.</w:t>
       </w:r>
     </w:p>
     <w:p>
@@ -7332,7 +7332,7 @@
           <w:sz w:val="36"/>
           <w:szCs w:val="36"/>
         </w:rPr>
-        <w:t>is a diagram of deterministic multi-language regeneration, showing source ingestion to Fact Units, the language-independent Fact Unit graph as a single knowledge source, and regeneration into any target language.</w:t>
+        <w:t xml:space="preserve">is a block diagram of the overall QueryBook Language Expression Layer (LEL) system architecture.</w:t>
       </w:r>
     </w:p>
     <w:p>
@@ -7360,7 +7360,7 @@
           <w:sz w:val="36"/>
           <w:szCs w:val="36"/>
         </w:rPr>
-        <w:t>is a diagram of semantic compression, expansion, colorization, and resolution upscaling, showing the meaning-storage compression flow and the on-demand regeneration of a surface representation.</w:t>
+        <w:t xml:space="preserve">is a block diagram of the Sub-Language Priming Layer (SLPL) and the measurable representation produced by each of its six components.</w:t>
       </w:r>
     </w:p>
     <w:p>
@@ -7388,7 +7388,7 @@
           <w:sz w:val="36"/>
           <w:szCs w:val="36"/>
         </w:rPr>
-        <w:t>is a diagram of the QueryBook-enhanced TCP/IP hybrid protocol packet, showing the optional semantic-metadata header carrying FUID, ProvenanceRef, and confidence fields alongside the standard headers and payload.</w:t>
+        <w:t xml:space="preserve">is a flow diagram of the developmental learning sequence and the one-way Transition Gate having four readiness thresholds.</w:t>
       </w:r>
     </w:p>
     <w:p>
@@ -7416,7 +7416,7 @@
           <w:sz w:val="36"/>
           <w:szCs w:val="36"/>
         </w:rPr>
-        <w:t>is a diagram of the Neuromorphic Cognitive Layer and attractor network, showing the energy function, the capacity ceiling, and convergence to a stable equilibrium.</w:t>
+        <w:t xml:space="preserve">is a block diagram of the multilingual Delta Acquisition Model and the acquisition acceleration flywheel.</w:t>
       </w:r>
     </w:p>
     <w:p>
@@ -7444,7 +7444,7 @@
           <w:sz w:val="36"/>
           <w:szCs w:val="36"/>
         </w:rPr>
-        <w:t xml:space="preserve">is a diagram of the Fact Unit confidence and evidence model, comprising an evidence pair, a Beta posterior, a score, a credible interval, source diversity, temporal decay, and a confidence trend.</w:t>
+        <w:t xml:space="preserve">is a block diagram of the seven-stage Speech Output Pipeline.</w:t>
       </w:r>
     </w:p>
     <w:p>
@@ -7472,7 +7472,7 @@
           <w:sz w:val="36"/>
           <w:szCs w:val="36"/>
         </w:rPr>
-        <w:t xml:space="preserve">is a diagram of the UFCS packet structure, showing the fields of a serialized Fact Unit record and an exemplar packet.</w:t>
+        <w:t xml:space="preserve">is a data-flow diagram of the co-grounded integration of the LEL with the Federated Query Language (FQL) and the Universal Federated Connectivity System (UFCS).</w:t>
       </w:r>
     </w:p>
     <w:p>
@@ -7500,7 +7500,7 @@
           <w:sz w:val="36"/>
           <w:szCs w:val="36"/>
         </w:rPr>
-        <w:t xml:space="preserve">is a diagram of UFCS packet framing, in which immutable packets are de-duplicated by fingerprint and appended to content-addressed blocks under a fingerprint index.</w:t>
+        <w:t xml:space="preserve">is a block diagram of a reduced-to-practice embodiment (the Language Lab) implementing Phase One, the Transition Gate, and a deterministic Phase Two.</w:t>
       </w:r>
     </w:p>
     <w:p>
@@ -7528,7 +7528,7 @@
           <w:sz w:val="36"/>
           <w:szCs w:val="36"/>
         </w:rPr>
-        <w:t xml:space="preserve">is a diagram of FQL query anatomy with a worked example, in which match, where, exclude, rank, and return clauses produce a highest-trust answer bound to its evidence by a provenance hash.</w:t>
+        <w:t xml:space="preserve">is a data-flow diagram of the deterministic Phase-Two semantic grounding of the reduced-to-practice embodiment, in which word meanings are attached only from auditable sources — a bundled public-domain dictionary and self-grounding against verified Fact Units in the store — with any large-language-model meaning source excluded from the grounding path.</w:t>
       </w:r>
     </w:p>
     <w:p>
@@ -8228,7 +8228,7 @@
           <w:sz w:val="36"/>
           <w:szCs w:val="36"/>
         </w:rPr>
-        <w:t xml:space="preserve">is a block diagram of the framed hybrid transport, extending FIG. 25, showing per-type compression, the frame with its header, metadata, payload, CRC32 checksum, and optional signature, the control, normal, and bulk lanes, the receiver, package rebuild with manifest check, and record verification into the Fact Unit store.</w:t>
+        <w:t xml:space="preserve">is a block diagram of the framed hybrid transport, extending FIG. 17, showing per-type compression, the frame with its header, metadata, payload, CRC32 checksum, and optional signature, the control, normal, and bulk lanes, the receiver, package rebuild with manifest check, and record verification into the Fact Unit store.</w:t>
       </w:r>
     </w:p>
     <w:p>
@@ -8251,8 +8251,21 @@
           <w:sz w:val="36"/>
           <w:szCs w:val="36"/>
         </w:rPr>
-        <w:t xml:space="preserve">[Drafting note: professional line-art drawings for FIG. </w:t>
-      </w:r>
+        <w:t>[Drafting note: professional line-art drawings for FIG. 1–4, 6, 12–13, and 17–18 are provided in the accompanying drawings PDF; FIG. 5, 7–11, and 14–16 are described above and their drawings are prepared to the same standard. Reference numerals follow the specification's element register. No performance, efficiency, or financial figures are asserted in the drawings.]</w:t>
+      </w:r>
+    </w:p>
+    <w:p>
+      <w:pPr>
+        <w:pStyle w:val="Normal"/>
+        <w:bidi w:val="0"/>
+        <w:spacing w:before="200" w:after="160"/>
+        <w:jc w:val="start"/>
+        <w:rPr>
+          <w:rFonts w:hint="eastAsia"/>
+          <w:sz w:val="36"/>
+          <w:szCs w:val="36"/>
+        </w:rPr>
+      </w:pPr>
       <w:r>
         <w:rPr>
           <w:rStyle w:val="Strong"/>
@@ -8261,260 +8274,7 @@
           <w:sz w:val="36"/>
           <w:szCs w:val="36"/>
         </w:rPr>
-        <w:t xml:space="preserve">9</w:t>
-      </w:r>
-      <w:r>
-        <w:rPr>
-          <w:rStyle w:val="Strong"/>
-          <w:i/>
-          <w:color w:val="555555"/>
-          <w:sz w:val="36"/>
-          <w:szCs w:val="36"/>
-        </w:rPr>
-        <w:t xml:space="preserve">–</w:t>
-      </w:r>
-      <w:r>
-        <w:rPr>
-          <w:rStyle w:val="Strong"/>
-          <w:i/>
-          <w:color w:val="555555"/>
-          <w:sz w:val="36"/>
-          <w:szCs w:val="36"/>
-        </w:rPr>
-        <w:t xml:space="preserve">12</w:t>
-      </w:r>
-      <w:r>
-        <w:rPr>
-          <w:rStyle w:val="Strong"/>
-          <w:i/>
-          <w:color w:val="555555"/>
-          <w:sz w:val="36"/>
-          <w:szCs w:val="36"/>
-        </w:rPr>
-        <w:t xml:space="preserve">, </w:t>
-      </w:r>
-      <w:r>
-        <w:rPr>
-          <w:rStyle w:val="Strong"/>
-          <w:i/>
-          <w:color w:val="555555"/>
-          <w:sz w:val="36"/>
-          <w:szCs w:val="36"/>
-        </w:rPr>
-        <w:t xml:space="preserve">14</w:t>
-      </w:r>
-      <w:r>
-        <w:rPr>
-          <w:rStyle w:val="Strong"/>
-          <w:i/>
-          <w:color w:val="555555"/>
-          <w:sz w:val="36"/>
-          <w:szCs w:val="36"/>
-        </w:rPr>
-        <w:t xml:space="preserve">, </w:t>
-      </w:r>
-      <w:r>
-        <w:rPr>
-          <w:rStyle w:val="Strong"/>
-          <w:i/>
-          <w:color w:val="555555"/>
-          <w:sz w:val="36"/>
-          <w:szCs w:val="36"/>
-        </w:rPr>
-        <w:t xml:space="preserve">20</w:t>
-      </w:r>
-      <w:r>
-        <w:rPr>
-          <w:rStyle w:val="Strong"/>
-          <w:i/>
-          <w:color w:val="555555"/>
-          <w:sz w:val="36"/>
-          <w:szCs w:val="36"/>
-        </w:rPr>
-        <w:t xml:space="preserve">–</w:t>
-      </w:r>
-      <w:r>
-        <w:rPr>
-          <w:rStyle w:val="Strong"/>
-          <w:i/>
-          <w:color w:val="555555"/>
-          <w:sz w:val="36"/>
-          <w:szCs w:val="36"/>
-        </w:rPr>
-        <w:t xml:space="preserve">21</w:t>
-      </w:r>
-      <w:r>
-        <w:rPr>
-          <w:rStyle w:val="Strong"/>
-          <w:i/>
-          <w:color w:val="555555"/>
-          <w:sz w:val="36"/>
-          <w:szCs w:val="36"/>
-        </w:rPr>
-        <w:t xml:space="preserve">, and </w:t>
-      </w:r>
-      <w:r>
-        <w:rPr>
-          <w:rStyle w:val="Strong"/>
-          <w:i/>
-          <w:color w:val="555555"/>
-          <w:sz w:val="36"/>
-          <w:szCs w:val="36"/>
-        </w:rPr>
-        <w:t xml:space="preserve">25</w:t>
-      </w:r>
-      <w:r>
-        <w:rPr>
-          <w:rStyle w:val="Strong"/>
-          <w:i/>
-          <w:color w:val="555555"/>
-          <w:sz w:val="36"/>
-          <w:szCs w:val="36"/>
-        </w:rPr>
-        <w:t xml:space="preserve">–</w:t>
-      </w:r>
-      <w:r>
-        <w:rPr>
-          <w:rStyle w:val="Strong"/>
-          <w:i/>
-          <w:color w:val="555555"/>
-          <w:sz w:val="36"/>
-          <w:szCs w:val="36"/>
-        </w:rPr>
-        <w:t xml:space="preserve">26</w:t>
-      </w:r>
-      <w:r>
-        <w:rPr>
-          <w:rStyle w:val="Strong"/>
-          <w:i/>
-          <w:color w:val="555555"/>
-          <w:sz w:val="36"/>
-          <w:szCs w:val="36"/>
-        </w:rPr>
-        <w:t xml:space="preserve"> are provided in the accompanying drawings PDF; FIG. </w:t>
-      </w:r>
-      <w:r>
-        <w:rPr>
-          <w:rStyle w:val="Strong"/>
-          <w:i/>
-          <w:color w:val="555555"/>
-          <w:sz w:val="36"/>
-          <w:szCs w:val="36"/>
-        </w:rPr>
-        <w:t xml:space="preserve">13</w:t>
-      </w:r>
-      <w:r>
-        <w:rPr>
-          <w:rStyle w:val="Strong"/>
-          <w:i/>
-          <w:color w:val="555555"/>
-          <w:sz w:val="36"/>
-          <w:szCs w:val="36"/>
-        </w:rPr>
-        <w:t xml:space="preserve">, </w:t>
-      </w:r>
-      <w:r>
-        <w:rPr>
-          <w:rStyle w:val="Strong"/>
-          <w:i/>
-          <w:color w:val="555555"/>
-          <w:sz w:val="36"/>
-          <w:szCs w:val="36"/>
-        </w:rPr>
-        <w:t xml:space="preserve">15</w:t>
-      </w:r>
-      <w:r>
-        <w:rPr>
-          <w:rStyle w:val="Strong"/>
-          <w:i/>
-          <w:color w:val="555555"/>
-          <w:sz w:val="36"/>
-          <w:szCs w:val="36"/>
-        </w:rPr>
-        <w:t xml:space="preserve">–</w:t>
-      </w:r>
-      <w:r>
-        <w:rPr>
-          <w:rStyle w:val="Strong"/>
-          <w:i/>
-          <w:color w:val="555555"/>
-          <w:sz w:val="36"/>
-          <w:szCs w:val="36"/>
-        </w:rPr>
-        <w:t xml:space="preserve">19</w:t>
-      </w:r>
-      <w:r>
-        <w:rPr>
-          <w:rStyle w:val="Strong"/>
-          <w:i/>
-          <w:color w:val="555555"/>
-          <w:sz w:val="36"/>
-          <w:szCs w:val="36"/>
-        </w:rPr>
-        <w:t xml:space="preserve">, and </w:t>
-      </w:r>
-      <w:r>
-        <w:rPr>
-          <w:rStyle w:val="Strong"/>
-          <w:i/>
-          <w:color w:val="555555"/>
-          <w:sz w:val="36"/>
-          <w:szCs w:val="36"/>
-        </w:rPr>
-        <w:t xml:space="preserve">22</w:t>
-      </w:r>
-      <w:r>
-        <w:rPr>
-          <w:rStyle w:val="Strong"/>
-          <w:i/>
-          <w:color w:val="555555"/>
-          <w:sz w:val="36"/>
-          <w:szCs w:val="36"/>
-        </w:rPr>
-        <w:t xml:space="preserve">–</w:t>
-      </w:r>
-      <w:r>
-        <w:rPr>
-          <w:rStyle w:val="Strong"/>
-          <w:i/>
-          <w:color w:val="555555"/>
-          <w:sz w:val="36"/>
-          <w:szCs w:val="36"/>
-        </w:rPr>
-        <w:t xml:space="preserve">24</w:t>
-      </w:r>
-      <w:r>
-        <w:rPr>
-          <w:rStyle w:val="Strong"/>
-          <w:i/>
-          <w:color w:val="555555"/>
-          <w:sz w:val="36"/>
-          <w:szCs w:val="36"/>
-        </w:rPr>
-        <w:t xml:space="preserve"> are described above and their drawings are prepared to the same standard. Reference numerals follow the specification's element register. No performance, efficiency, or financial figures are asserted in the drawings.]</w:t>
-      </w:r>
-    </w:p>
-    <w:p>
-      <w:pPr>
-        <w:pStyle w:val="Normal"/>
-        <w:bidi w:val="0"/>
-        <w:spacing w:before="200" w:after="160"/>
-        <w:jc w:val="start"/>
-        <w:rPr>
-          <w:rFonts w:hint="eastAsia"/>
-          <w:sz w:val="36"/>
-          <w:szCs w:val="36"/>
-        </w:rPr>
-      </w:pPr>
-      <w:r>
-        <w:rPr>
-          <w:rStyle w:val="Strong"/>
-          <w:i/>
-          <w:color w:val="555555"/>
-          <w:sz w:val="36"/>
-          <w:szCs w:val="36"/>
-        </w:rPr>
-        <w:t xml:space="preserve">[Drafting note: the complete drawing set, FIG. 1–55, is provided in the accompanying drawings PDF; reference numerals 5000–5550 used in FIG. 50–55 are identified in the Detailed Description.]</w:t>
+        <w:t xml:space="preserve">[Drafting note: the complete drawing set, FIG. 1–55, is provided in the accompanying drawings PDF, one figure per sheet; reference numerals 5000–5550 used in FIG. 50–55 are identified in the Detailed Description.]</w:t>
       </w:r>
     </w:p>
     <w:p>
@@ -14254,7 +14014,7 @@
         <w:rPr>
           <w:rFonts w:ascii="Times New Roman" w:hAnsi="Times New Roman"/>
         </w:rPr>
-        <w:t xml:space="preserve">Extending the protocol of FIG. 25, a producer node (5500) applies per-type compression (5510) — record batches by a dictionary primed with record field names, media by a standard codec left unaltered — and packs the result into frames (5520) comprising a 32-byte header (5521), metadata (5522), payload (5523), a CRC32 checksum (5524), and an optional signature (5525). Frames travel on a control lane (5530), a normal lane (5531), and a bulk lane (5532), each with its own connection, rate limit, and receipt window, so a bulk transfer cannot hold a control message or a live stream behind it. The receiver (5541) drops a frame failing plausibility, checksum, or signature checks and resynchronizes at the next marker; media is rebuilt into HLS, MPEG-DASH, or RTMP packages with a manifest check (5543), and records pass verification into the Fact Unit store (5550). The transport neither enlarges nor alters a compressed asset.</w:t>
+        <w:t xml:space="preserve">Extending the protocol of FIG. 17, a producer node (5500) applies per-type compression (5510) — record batches by a dictionary primed with record field names, media by a standard codec left unaltered — and packs the result into frames (5520) comprising a 32-byte header (5521), metadata (5522), payload (5523), a CRC32 checksum (5524), and an optional signature (5525). Frames travel on a control lane (5530), a normal lane (5531), and a bulk lane (5532), each with its own connection, rate limit, and receipt window, so a bulk transfer cannot hold a control message or a live stream behind it. The receiver (5541) drops a frame failing plausibility, checksum, or signature checks and resynchronizes at the next marker; media is rebuilt into HLS, MPEG-DASH, or RTMP packages with a manifest check (5543), and records pass verification into the Fact Unit store (5550). The transport neither enlarges nor alters a compressed asset.</w:t>
       </w:r>
     </w:p>
     <w:p>

</xml_diff>